<commit_message>
esercizi con i grafi
(guardare anche word con qualche spiegazione aggiuntiva)
</commit_message>
<xml_diff>
--- a/Appunti lezione/Esercizi con i grafi.docx
+++ b/Appunti lezione/Esercizi con i grafi.docx
@@ -37,42 +37,15 @@
         </w:rPr>
         <w:t xml:space="preserve">2) </w:t>
       </w:r>
-      <w:r>
-        <w:rPr>
-          <w:rFonts w:ascii="Aptos" w:eastAsia="Aptos" w:hAnsi="Aptos" w:cs="Times New Roman"/>
-        </w:rPr>
-        <w:fldChar w:fldCharType="begin"/>
-      </w:r>
-      <w:r>
-        <w:rPr>
-          <w:rFonts w:ascii="Aptos" w:eastAsia="Aptos" w:hAnsi="Aptos" w:cs="Times New Roman"/>
-        </w:rPr>
-        <w:instrText>HYPERLINK "C:\\Users\\Epban\\Desktop\\Universita\\cpp\\Esami\\practice\\Esercizi_grafi\\Esercizi_grafi\\grlist_es2.h"</w:instrText>
-      </w:r>
-      <w:r>
-        <w:rPr>
-          <w:rFonts w:ascii="Aptos" w:eastAsia="Aptos" w:hAnsi="Aptos" w:cs="Times New Roman"/>
-        </w:rPr>
-      </w:r>
-      <w:r>
-        <w:rPr>
-          <w:rFonts w:ascii="Aptos" w:eastAsia="Aptos" w:hAnsi="Aptos" w:cs="Times New Roman"/>
-        </w:rPr>
-        <w:fldChar w:fldCharType="separate"/>
-      </w:r>
-      <w:r>
-        <w:rPr>
-          <w:rStyle w:val="Hyperlink"/>
-          <w:rFonts w:ascii="Aptos" w:eastAsia="Aptos" w:hAnsi="Aptos" w:cs="Times New Roman"/>
-        </w:rPr>
-        <w:t>C:\Users\Epban\Desktop\Universita\cpp\Esami\practice\Esercizi_grafi\Esercizi_grafi\grlist_es2.h</w:t>
-      </w:r>
-      <w:r>
-        <w:rPr>
-          <w:rFonts w:ascii="Aptos" w:eastAsia="Aptos" w:hAnsi="Aptos" w:cs="Times New Roman"/>
-        </w:rPr>
-        <w:fldChar w:fldCharType="end"/>
-      </w:r>
+      <w:hyperlink r:id="rId5" w:history="1">
+        <w:r>
+          <w:rPr>
+            <w:rStyle w:val="Hyperlink"/>
+            <w:rFonts w:ascii="Aptos" w:eastAsia="Aptos" w:hAnsi="Aptos" w:cs="Times New Roman"/>
+          </w:rPr>
+          <w:t>C:\Users\Epban\Desktop\Universita\cpp\Esami\practice\Esercizi_grafi\Esercizi_grafi\grlist_es2.h</w:t>
+        </w:r>
+      </w:hyperlink>
     </w:p>
     <w:p>
       <w:pPr>
@@ -131,26 +104,20 @@
         <w:rPr>
           <w:rFonts w:ascii="Aptos" w:eastAsia="Aptos" w:hAnsi="Aptos" w:cs="Times New Roman"/>
         </w:rPr>
-        <w:t>Richiede di creare un grafo randomico il quale abbia massimo K archi uscenti per ogni nodo</w:t>
-      </w:r>
-      <w:r>
+        <w:t>Richiede di creare un grafo randomico il quale abbia massimo K archi uscenti per ogni nodo.</w:t>
+      </w:r>
+    </w:p>
+    <w:p>
+      <w:pPr>
+        <w:spacing w:line="276" w:lineRule="auto"/>
         <w:rPr>
           <w:rFonts w:ascii="Aptos" w:eastAsia="Aptos" w:hAnsi="Aptos" w:cs="Times New Roman"/>
         </w:rPr>
-        <w:t>.</w:t>
-      </w:r>
-    </w:p>
-    <w:p>
-      <w:pPr>
-        <w:spacing w:line="276" w:lineRule="auto"/>
+      </w:pPr>
+      <w:r>
         <w:rPr>
           <w:rFonts w:ascii="Aptos" w:eastAsia="Aptos" w:hAnsi="Aptos" w:cs="Times New Roman"/>
         </w:rPr>
-      </w:pPr>
-      <w:r>
-        <w:rPr>
-          <w:rFonts w:ascii="Aptos" w:eastAsia="Aptos" w:hAnsi="Aptos" w:cs="Times New Roman"/>
-        </w:rPr>
         <w:t>Oss. Il numero di nodi e’ conosciuto siccome inizializzato alla creazione e contenuto in numVertex.</w:t>
       </w:r>
     </w:p>
@@ -177,48 +144,8 @@
           <w:lang w:val="en-BE" w:eastAsia="en-BE"/>
           <w14:ligatures w14:val="none"/>
         </w:rPr>
-        <w:t xml:space="preserve">//k = max </w:t>
-      </w:r>
-      <w:proofErr w:type="spellStart"/>
-      <w:r>
-        <w:rPr>
-          <w:rFonts w:ascii="Cascadia Mono" w:eastAsia="Times New Roman" w:hAnsi="Cascadia Mono" w:cs="Cascadia Mono"/>
-          <w:color w:val="008000"/>
-          <w:kern w:val="0"/>
-          <w:sz w:val="18"/>
-          <w:szCs w:val="18"/>
-          <w:lang w:val="en-BE" w:eastAsia="en-BE"/>
-          <w14:ligatures w14:val="none"/>
-        </w:rPr>
-        <w:t>spigoli</w:t>
-      </w:r>
-      <w:proofErr w:type="spellEnd"/>
-      <w:r>
-        <w:rPr>
-          <w:rFonts w:ascii="Cascadia Mono" w:eastAsia="Times New Roman" w:hAnsi="Cascadia Mono" w:cs="Cascadia Mono"/>
-          <w:color w:val="008000"/>
-          <w:kern w:val="0"/>
-          <w:sz w:val="18"/>
-          <w:szCs w:val="18"/>
-          <w:lang w:val="en-BE" w:eastAsia="en-BE"/>
-          <w14:ligatures w14:val="none"/>
-        </w:rPr>
-        <w:t xml:space="preserve"> </w:t>
-      </w:r>
-      <w:proofErr w:type="spellStart"/>
-      <w:r>
-        <w:rPr>
-          <w:rFonts w:ascii="Cascadia Mono" w:eastAsia="Times New Roman" w:hAnsi="Cascadia Mono" w:cs="Cascadia Mono"/>
-          <w:color w:val="008000"/>
-          <w:kern w:val="0"/>
-          <w:sz w:val="18"/>
-          <w:szCs w:val="18"/>
-          <w:lang w:val="en-BE" w:eastAsia="en-BE"/>
-          <w14:ligatures w14:val="none"/>
-        </w:rPr>
-        <w:t>uscenti</w:t>
-      </w:r>
-      <w:proofErr w:type="spellEnd"/>
+        <w:t>//k = max spigoli uscenti</w:t>
+      </w:r>
     </w:p>
     <w:p>
       <w:pPr>
@@ -273,36 +200,8 @@
           <w:lang w:val="en-BE" w:eastAsia="en-BE"/>
           <w14:ligatures w14:val="none"/>
         </w:rPr>
-        <w:t xml:space="preserve"> </w:t>
-      </w:r>
-      <w:proofErr w:type="spellStart"/>
-      <w:proofErr w:type="gramStart"/>
-      <w:r>
-        <w:rPr>
-          <w:rFonts w:ascii="Cascadia Mono" w:eastAsia="Times New Roman" w:hAnsi="Cascadia Mono" w:cs="Cascadia Mono"/>
-          <w:color w:val="000000"/>
-          <w:kern w:val="0"/>
-          <w:sz w:val="18"/>
-          <w:szCs w:val="18"/>
-          <w:lang w:val="en-BE" w:eastAsia="en-BE"/>
-          <w14:ligatures w14:val="none"/>
-        </w:rPr>
-        <w:t>createRandomGraph</w:t>
-      </w:r>
-      <w:proofErr w:type="spellEnd"/>
-      <w:r>
-        <w:rPr>
-          <w:rFonts w:ascii="Cascadia Mono" w:eastAsia="Times New Roman" w:hAnsi="Cascadia Mono" w:cs="Cascadia Mono"/>
-          <w:color w:val="000000"/>
-          <w:kern w:val="0"/>
-          <w:sz w:val="18"/>
-          <w:szCs w:val="18"/>
-          <w:lang w:val="en-BE" w:eastAsia="en-BE"/>
-          <w14:ligatures w14:val="none"/>
-        </w:rPr>
-        <w:t>(</w:t>
-      </w:r>
-      <w:proofErr w:type="gramEnd"/>
+        <w:t xml:space="preserve"> createRandomGraph(</w:t>
+      </w:r>
       <w:r>
         <w:rPr>
           <w:rFonts w:ascii="Cascadia Mono" w:eastAsia="Times New Roman" w:hAnsi="Cascadia Mono" w:cs="Cascadia Mono"/>
@@ -441,111 +340,7 @@
           <w:lang w:val="en-BE" w:eastAsia="en-BE"/>
           <w14:ligatures w14:val="none"/>
         </w:rPr>
-        <w:t xml:space="preserve"> </w:t>
-      </w:r>
-      <w:proofErr w:type="spellStart"/>
-      <w:r>
-        <w:rPr>
-          <w:rFonts w:ascii="Cascadia Mono" w:eastAsia="Times New Roman" w:hAnsi="Cascadia Mono" w:cs="Cascadia Mono"/>
-          <w:color w:val="000000"/>
-          <w:kern w:val="0"/>
-          <w:sz w:val="18"/>
-          <w:szCs w:val="18"/>
-          <w:lang w:val="en-BE" w:eastAsia="en-BE"/>
-          <w14:ligatures w14:val="none"/>
-        </w:rPr>
-        <w:t>i</w:t>
-      </w:r>
-      <w:proofErr w:type="spellEnd"/>
-      <w:r>
-        <w:rPr>
-          <w:rFonts w:ascii="Cascadia Mono" w:eastAsia="Times New Roman" w:hAnsi="Cascadia Mono" w:cs="Cascadia Mono"/>
-          <w:color w:val="000000"/>
-          <w:kern w:val="0"/>
-          <w:sz w:val="18"/>
-          <w:szCs w:val="18"/>
-          <w:lang w:val="en-BE" w:eastAsia="en-BE"/>
-          <w14:ligatures w14:val="none"/>
-        </w:rPr>
-        <w:t xml:space="preserve"> = 0; </w:t>
-      </w:r>
-      <w:proofErr w:type="spellStart"/>
-      <w:r>
-        <w:rPr>
-          <w:rFonts w:ascii="Cascadia Mono" w:eastAsia="Times New Roman" w:hAnsi="Cascadia Mono" w:cs="Cascadia Mono"/>
-          <w:color w:val="000000"/>
-          <w:kern w:val="0"/>
-          <w:sz w:val="18"/>
-          <w:szCs w:val="18"/>
-          <w:lang w:val="en-BE" w:eastAsia="en-BE"/>
-          <w14:ligatures w14:val="none"/>
-        </w:rPr>
-        <w:t>i</w:t>
-      </w:r>
-      <w:proofErr w:type="spellEnd"/>
-      <w:r>
-        <w:rPr>
-          <w:rFonts w:ascii="Cascadia Mono" w:eastAsia="Times New Roman" w:hAnsi="Cascadia Mono" w:cs="Cascadia Mono"/>
-          <w:color w:val="000000"/>
-          <w:kern w:val="0"/>
-          <w:sz w:val="18"/>
-          <w:szCs w:val="18"/>
-          <w:lang w:val="en-BE" w:eastAsia="en-BE"/>
-          <w14:ligatures w14:val="none"/>
-        </w:rPr>
-        <w:t xml:space="preserve"> &lt; </w:t>
-      </w:r>
-      <w:proofErr w:type="spellStart"/>
-      <w:r>
-        <w:rPr>
-          <w:rFonts w:ascii="Cascadia Mono" w:eastAsia="Times New Roman" w:hAnsi="Cascadia Mono" w:cs="Cascadia Mono"/>
-          <w:color w:val="000000"/>
-          <w:kern w:val="0"/>
-          <w:sz w:val="18"/>
-          <w:szCs w:val="18"/>
-          <w:lang w:val="en-BE" w:eastAsia="en-BE"/>
-          <w14:ligatures w14:val="none"/>
-        </w:rPr>
-        <w:t>numVertex</w:t>
-      </w:r>
-      <w:proofErr w:type="spellEnd"/>
-      <w:r>
-        <w:rPr>
-          <w:rFonts w:ascii="Cascadia Mono" w:eastAsia="Times New Roman" w:hAnsi="Cascadia Mono" w:cs="Cascadia Mono"/>
-          <w:color w:val="000000"/>
-          <w:kern w:val="0"/>
-          <w:sz w:val="18"/>
-          <w:szCs w:val="18"/>
-          <w:lang w:val="en-BE" w:eastAsia="en-BE"/>
-          <w14:ligatures w14:val="none"/>
-        </w:rPr>
-        <w:t xml:space="preserve">; </w:t>
-      </w:r>
-      <w:proofErr w:type="spellStart"/>
-      <w:r>
-        <w:rPr>
-          <w:rFonts w:ascii="Cascadia Mono" w:eastAsia="Times New Roman" w:hAnsi="Cascadia Mono" w:cs="Cascadia Mono"/>
-          <w:color w:val="000000"/>
-          <w:kern w:val="0"/>
-          <w:sz w:val="18"/>
-          <w:szCs w:val="18"/>
-          <w:lang w:val="en-BE" w:eastAsia="en-BE"/>
-          <w14:ligatures w14:val="none"/>
-        </w:rPr>
-        <w:t>i</w:t>
-      </w:r>
-      <w:proofErr w:type="spellEnd"/>
-      <w:r>
-        <w:rPr>
-          <w:rFonts w:ascii="Cascadia Mono" w:eastAsia="Times New Roman" w:hAnsi="Cascadia Mono" w:cs="Cascadia Mono"/>
-          <w:color w:val="000000"/>
-          <w:kern w:val="0"/>
-          <w:sz w:val="18"/>
-          <w:szCs w:val="18"/>
-          <w:lang w:val="en-BE" w:eastAsia="en-BE"/>
-          <w14:ligatures w14:val="none"/>
-        </w:rPr>
-        <w:t>++) {</w:t>
+        <w:t xml:space="preserve"> i = 0; i &lt; numVertex; i++) {</w:t>
       </w:r>
     </w:p>
     <w:p>
@@ -841,33 +636,7 @@
           <w:lang w:val="en-BE" w:eastAsia="en-BE"/>
           <w14:ligatures w14:val="none"/>
         </w:rPr>
-        <w:t xml:space="preserve"> &amp;&amp; j &lt; </w:t>
-      </w:r>
-      <w:proofErr w:type="spellStart"/>
-      <w:r>
-        <w:rPr>
-          <w:rFonts w:ascii="Cascadia Mono" w:eastAsia="Times New Roman" w:hAnsi="Cascadia Mono" w:cs="Cascadia Mono"/>
-          <w:color w:val="000000"/>
-          <w:kern w:val="0"/>
-          <w:sz w:val="18"/>
-          <w:szCs w:val="18"/>
-          <w:lang w:val="en-BE" w:eastAsia="en-BE"/>
-          <w14:ligatures w14:val="none"/>
-        </w:rPr>
-        <w:t>numVertex</w:t>
-      </w:r>
-      <w:proofErr w:type="spellEnd"/>
-      <w:r>
-        <w:rPr>
-          <w:rFonts w:ascii="Cascadia Mono" w:eastAsia="Times New Roman" w:hAnsi="Cascadia Mono" w:cs="Cascadia Mono"/>
-          <w:color w:val="000000"/>
-          <w:kern w:val="0"/>
-          <w:sz w:val="18"/>
-          <w:szCs w:val="18"/>
-          <w:lang w:val="en-BE" w:eastAsia="en-BE"/>
-          <w14:ligatures w14:val="none"/>
-        </w:rPr>
-        <w:t>) {</w:t>
+        <w:t xml:space="preserve"> &amp;&amp; j &lt; numVertex) {</w:t>
       </w:r>
     </w:p>
     <w:p>
@@ -959,33 +728,7 @@
           <w:lang w:val="en-BE" w:eastAsia="en-BE"/>
           <w14:ligatures w14:val="none"/>
         </w:rPr>
-        <w:t xml:space="preserve"> decision = </w:t>
-      </w:r>
-      <w:proofErr w:type="gramStart"/>
-      <w:r>
-        <w:rPr>
-          <w:rFonts w:ascii="Cascadia Mono" w:eastAsia="Times New Roman" w:hAnsi="Cascadia Mono" w:cs="Cascadia Mono"/>
-          <w:color w:val="000000"/>
-          <w:kern w:val="0"/>
-          <w:sz w:val="18"/>
-          <w:szCs w:val="18"/>
-          <w:lang w:val="en-BE" w:eastAsia="en-BE"/>
-          <w14:ligatures w14:val="none"/>
-        </w:rPr>
-        <w:t>rand(</w:t>
-      </w:r>
-      <w:proofErr w:type="gramEnd"/>
-      <w:r>
-        <w:rPr>
-          <w:rFonts w:ascii="Cascadia Mono" w:eastAsia="Times New Roman" w:hAnsi="Cascadia Mono" w:cs="Cascadia Mono"/>
-          <w:color w:val="000000"/>
-          <w:kern w:val="0"/>
-          <w:sz w:val="18"/>
-          <w:szCs w:val="18"/>
-          <w:lang w:val="en-BE" w:eastAsia="en-BE"/>
-          <w14:ligatures w14:val="none"/>
-        </w:rPr>
-        <w:t xml:space="preserve">) % 2; </w:t>
+        <w:t xml:space="preserve"> decision = rand() % 2; </w:t>
       </w:r>
       <w:r>
         <w:rPr>
@@ -997,33 +740,7 @@
           <w:lang w:val="en-BE" w:eastAsia="en-BE"/>
           <w14:ligatures w14:val="none"/>
         </w:rPr>
-        <w:t xml:space="preserve">// 50% di </w:t>
-      </w:r>
-      <w:proofErr w:type="spellStart"/>
-      <w:r>
-        <w:rPr>
-          <w:rFonts w:ascii="Cascadia Mono" w:eastAsia="Times New Roman" w:hAnsi="Cascadia Mono" w:cs="Cascadia Mono"/>
-          <w:color w:val="008000"/>
-          <w:kern w:val="0"/>
-          <w:sz w:val="18"/>
-          <w:szCs w:val="18"/>
-          <w:lang w:val="en-BE" w:eastAsia="en-BE"/>
-          <w14:ligatures w14:val="none"/>
-        </w:rPr>
-        <w:t>probabilita</w:t>
-      </w:r>
-      <w:proofErr w:type="spellEnd"/>
-      <w:r>
-        <w:rPr>
-          <w:rFonts w:ascii="Cascadia Mono" w:eastAsia="Times New Roman" w:hAnsi="Cascadia Mono" w:cs="Cascadia Mono"/>
-          <w:color w:val="008000"/>
-          <w:kern w:val="0"/>
-          <w:sz w:val="18"/>
-          <w:szCs w:val="18"/>
-          <w:lang w:val="en-BE" w:eastAsia="en-BE"/>
-          <w14:ligatures w14:val="none"/>
-        </w:rPr>
-        <w:t>'</w:t>
+        <w:t>// 50% di probabilita'</w:t>
       </w:r>
     </w:p>
     <w:p>
@@ -1196,60 +913,7 @@
           <w14:ligatures w14:val="none"/>
         </w:rPr>
         <w:tab/>
-      </w:r>
-      <w:proofErr w:type="spellStart"/>
-      <w:proofErr w:type="gramStart"/>
-      <w:r>
-        <w:rPr>
-          <w:rFonts w:ascii="Cascadia Mono" w:eastAsia="Times New Roman" w:hAnsi="Cascadia Mono" w:cs="Cascadia Mono"/>
-          <w:color w:val="000000"/>
-          <w:kern w:val="0"/>
-          <w:sz w:val="18"/>
-          <w:szCs w:val="18"/>
-          <w:lang w:val="en-BE" w:eastAsia="en-BE"/>
-          <w14:ligatures w14:val="none"/>
-        </w:rPr>
-        <w:t>setEdge</w:t>
-      </w:r>
-      <w:proofErr w:type="spellEnd"/>
-      <w:r>
-        <w:rPr>
-          <w:rFonts w:ascii="Cascadia Mono" w:eastAsia="Times New Roman" w:hAnsi="Cascadia Mono" w:cs="Cascadia Mono"/>
-          <w:color w:val="000000"/>
-          <w:kern w:val="0"/>
-          <w:sz w:val="18"/>
-          <w:szCs w:val="18"/>
-          <w:lang w:val="en-BE" w:eastAsia="en-BE"/>
-          <w14:ligatures w14:val="none"/>
-        </w:rPr>
-        <w:t>(</w:t>
-      </w:r>
-      <w:proofErr w:type="spellStart"/>
-      <w:proofErr w:type="gramEnd"/>
-      <w:r>
-        <w:rPr>
-          <w:rFonts w:ascii="Cascadia Mono" w:eastAsia="Times New Roman" w:hAnsi="Cascadia Mono" w:cs="Cascadia Mono"/>
-          <w:color w:val="000000"/>
-          <w:kern w:val="0"/>
-          <w:sz w:val="18"/>
-          <w:szCs w:val="18"/>
-          <w:lang w:val="en-BE" w:eastAsia="en-BE"/>
-          <w14:ligatures w14:val="none"/>
-        </w:rPr>
-        <w:t>i</w:t>
-      </w:r>
-      <w:proofErr w:type="spellEnd"/>
-      <w:r>
-        <w:rPr>
-          <w:rFonts w:ascii="Cascadia Mono" w:eastAsia="Times New Roman" w:hAnsi="Cascadia Mono" w:cs="Cascadia Mono"/>
-          <w:color w:val="000000"/>
-          <w:kern w:val="0"/>
-          <w:sz w:val="18"/>
-          <w:szCs w:val="18"/>
-          <w:lang w:val="en-BE" w:eastAsia="en-BE"/>
-          <w14:ligatures w14:val="none"/>
-        </w:rPr>
-        <w:t>, j, 1);</w:t>
+        <w:t>setEdge(i, j, 1);</w:t>
       </w:r>
     </w:p>
     <w:p>
@@ -1468,32 +1132,7 @@
           <w14:ligatures w14:val="none"/>
         </w:rPr>
         <w:tab/>
-      </w:r>
-      <w:proofErr w:type="spellStart"/>
-      <w:r>
-        <w:rPr>
-          <w:rFonts w:ascii="Cascadia Mono" w:eastAsia="Times New Roman" w:hAnsi="Cascadia Mono" w:cs="Cascadia Mono"/>
-          <w:color w:val="000000"/>
-          <w:kern w:val="0"/>
-          <w:sz w:val="18"/>
-          <w:szCs w:val="18"/>
-          <w:lang w:val="en-BE" w:eastAsia="en-BE"/>
-          <w14:ligatures w14:val="none"/>
-        </w:rPr>
-        <w:t>j++</w:t>
-      </w:r>
-      <w:proofErr w:type="spellEnd"/>
-      <w:r>
-        <w:rPr>
-          <w:rFonts w:ascii="Cascadia Mono" w:eastAsia="Times New Roman" w:hAnsi="Cascadia Mono" w:cs="Cascadia Mono"/>
-          <w:color w:val="000000"/>
-          <w:kern w:val="0"/>
-          <w:sz w:val="18"/>
-          <w:szCs w:val="18"/>
-          <w:lang w:val="en-BE" w:eastAsia="en-BE"/>
-          <w14:ligatures w14:val="none"/>
-        </w:rPr>
-        <w:t>;</w:t>
+        <w:t>j++;</w:t>
       </w:r>
     </w:p>
     <w:p>
@@ -1715,59 +1354,7 @@
           <w:lang w:val="en-BE" w:eastAsia="en-BE"/>
           <w14:ligatures w14:val="none"/>
         </w:rPr>
-        <w:t xml:space="preserve">E’ </w:t>
-      </w:r>
-      <w:proofErr w:type="spellStart"/>
-      <w:r>
-        <w:rPr>
-          <w:rFonts w:ascii="Cascadia Mono" w:eastAsia="Times New Roman" w:hAnsi="Cascadia Mono" w:cs="Cascadia Mono"/>
-          <w:color w:val="000000"/>
-          <w:kern w:val="0"/>
-          <w:sz w:val="18"/>
-          <w:szCs w:val="18"/>
-          <w:lang w:val="en-BE" w:eastAsia="en-BE"/>
-          <w14:ligatures w14:val="none"/>
-        </w:rPr>
-        <w:t>una</w:t>
-      </w:r>
-      <w:proofErr w:type="spellEnd"/>
-      <w:r>
-        <w:rPr>
-          <w:rFonts w:ascii="Cascadia Mono" w:eastAsia="Times New Roman" w:hAnsi="Cascadia Mono" w:cs="Cascadia Mono"/>
-          <w:color w:val="000000"/>
-          <w:kern w:val="0"/>
-          <w:sz w:val="18"/>
-          <w:szCs w:val="18"/>
-          <w:lang w:val="en-BE" w:eastAsia="en-BE"/>
-          <w14:ligatures w14:val="none"/>
-        </w:rPr>
-        <w:t xml:space="preserve"> </w:t>
-      </w:r>
-      <w:proofErr w:type="spellStart"/>
-      <w:r>
-        <w:rPr>
-          <w:rFonts w:ascii="Cascadia Mono" w:eastAsia="Times New Roman" w:hAnsi="Cascadia Mono" w:cs="Cascadia Mono"/>
-          <w:color w:val="000000"/>
-          <w:kern w:val="0"/>
-          <w:sz w:val="18"/>
-          <w:szCs w:val="18"/>
-          <w:lang w:val="en-BE" w:eastAsia="en-BE"/>
-          <w14:ligatures w14:val="none"/>
-        </w:rPr>
-        <w:t>soluzione</w:t>
-      </w:r>
-      <w:proofErr w:type="spellEnd"/>
-      <w:r>
-        <w:rPr>
-          <w:rFonts w:ascii="Cascadia Mono" w:eastAsia="Times New Roman" w:hAnsi="Cascadia Mono" w:cs="Cascadia Mono"/>
-          <w:color w:val="000000"/>
-          <w:kern w:val="0"/>
-          <w:sz w:val="18"/>
-          <w:szCs w:val="18"/>
-          <w:lang w:val="en-BE" w:eastAsia="en-BE"/>
-          <w14:ligatures w14:val="none"/>
-        </w:rPr>
-        <w:t xml:space="preserve"> </w:t>
+        <w:t xml:space="preserve">E’ una soluzione </w:t>
       </w:r>
       <w:r>
         <w:rPr>
@@ -1793,891 +1380,7 @@
           <w:lang w:val="en-BE" w:eastAsia="en-BE"/>
           <w14:ligatures w14:val="none"/>
         </w:rPr>
-        <w:t xml:space="preserve"> non </w:t>
-      </w:r>
-      <w:proofErr w:type="spellStart"/>
-      <w:r>
-        <w:rPr>
-          <w:rFonts w:ascii="Cascadia Mono" w:eastAsia="Times New Roman" w:hAnsi="Cascadia Mono" w:cs="Cascadia Mono"/>
-          <w:color w:val="000000"/>
-          <w:kern w:val="0"/>
-          <w:sz w:val="18"/>
-          <w:szCs w:val="18"/>
-          <w:lang w:val="en-BE" w:eastAsia="en-BE"/>
-          <w14:ligatures w14:val="none"/>
-        </w:rPr>
-        <w:t>ottima</w:t>
-      </w:r>
-      <w:proofErr w:type="spellEnd"/>
-      <w:r>
-        <w:rPr>
-          <w:rFonts w:ascii="Cascadia Mono" w:eastAsia="Times New Roman" w:hAnsi="Cascadia Mono" w:cs="Cascadia Mono"/>
-          <w:color w:val="000000"/>
-          <w:kern w:val="0"/>
-          <w:sz w:val="18"/>
-          <w:szCs w:val="18"/>
-          <w:lang w:val="en-BE" w:eastAsia="en-BE"/>
-          <w14:ligatures w14:val="none"/>
-        </w:rPr>
-        <w:t xml:space="preserve"> </w:t>
-      </w:r>
-      <w:proofErr w:type="spellStart"/>
-      <w:r>
-        <w:rPr>
-          <w:rFonts w:ascii="Cascadia Mono" w:eastAsia="Times New Roman" w:hAnsi="Cascadia Mono" w:cs="Cascadia Mono"/>
-          <w:color w:val="000000"/>
-          <w:kern w:val="0"/>
-          <w:sz w:val="18"/>
-          <w:szCs w:val="18"/>
-          <w:lang w:val="en-BE" w:eastAsia="en-BE"/>
-          <w14:ligatures w14:val="none"/>
-        </w:rPr>
-        <w:t>perche</w:t>
-      </w:r>
-      <w:proofErr w:type="spellEnd"/>
-      <w:r>
-        <w:rPr>
-          <w:rFonts w:ascii="Cascadia Mono" w:eastAsia="Times New Roman" w:hAnsi="Cascadia Mono" w:cs="Cascadia Mono"/>
-          <w:color w:val="000000"/>
-          <w:kern w:val="0"/>
-          <w:sz w:val="18"/>
-          <w:szCs w:val="18"/>
-          <w:lang w:val="en-BE" w:eastAsia="en-BE"/>
-          <w14:ligatures w14:val="none"/>
-        </w:rPr>
-        <w:t xml:space="preserve">’ </w:t>
-      </w:r>
-      <w:proofErr w:type="spellStart"/>
-      <w:r>
-        <w:rPr>
-          <w:rFonts w:ascii="Cascadia Mono" w:eastAsia="Times New Roman" w:hAnsi="Cascadia Mono" w:cs="Cascadia Mono"/>
-          <w:color w:val="000000"/>
-          <w:kern w:val="0"/>
-          <w:sz w:val="18"/>
-          <w:szCs w:val="18"/>
-          <w:lang w:val="en-BE" w:eastAsia="en-BE"/>
-          <w14:ligatures w14:val="none"/>
-        </w:rPr>
-        <w:t>funziona</w:t>
-      </w:r>
-      <w:proofErr w:type="spellEnd"/>
-      <w:r>
-        <w:rPr>
-          <w:rFonts w:ascii="Cascadia Mono" w:eastAsia="Times New Roman" w:hAnsi="Cascadia Mono" w:cs="Cascadia Mono"/>
-          <w:color w:val="000000"/>
-          <w:kern w:val="0"/>
-          <w:sz w:val="18"/>
-          <w:szCs w:val="18"/>
-          <w:lang w:val="en-BE" w:eastAsia="en-BE"/>
-          <w14:ligatures w14:val="none"/>
-        </w:rPr>
-        <w:t xml:space="preserve"> solo </w:t>
-      </w:r>
-      <w:proofErr w:type="spellStart"/>
-      <w:r>
-        <w:rPr>
-          <w:rFonts w:ascii="Cascadia Mono" w:eastAsia="Times New Roman" w:hAnsi="Cascadia Mono" w:cs="Cascadia Mono"/>
-          <w:color w:val="000000"/>
-          <w:kern w:val="0"/>
-          <w:sz w:val="18"/>
-          <w:szCs w:val="18"/>
-          <w:lang w:val="en-BE" w:eastAsia="en-BE"/>
-          <w14:ligatures w14:val="none"/>
-        </w:rPr>
-        <w:t>grafi</w:t>
-      </w:r>
-      <w:proofErr w:type="spellEnd"/>
-      <w:r>
-        <w:rPr>
-          <w:rFonts w:ascii="Cascadia Mono" w:eastAsia="Times New Roman" w:hAnsi="Cascadia Mono" w:cs="Cascadia Mono"/>
-          <w:color w:val="000000"/>
-          <w:kern w:val="0"/>
-          <w:sz w:val="18"/>
-          <w:szCs w:val="18"/>
-          <w:lang w:val="en-BE" w:eastAsia="en-BE"/>
-          <w14:ligatures w14:val="none"/>
-        </w:rPr>
-        <w:t xml:space="preserve"> con </w:t>
-      </w:r>
-      <w:proofErr w:type="spellStart"/>
-      <w:r>
-        <w:rPr>
-          <w:rFonts w:ascii="Cascadia Mono" w:eastAsia="Times New Roman" w:hAnsi="Cascadia Mono" w:cs="Cascadia Mono"/>
-          <w:color w:val="000000"/>
-          <w:kern w:val="0"/>
-          <w:sz w:val="18"/>
-          <w:szCs w:val="18"/>
-          <w:lang w:val="en-BE" w:eastAsia="en-BE"/>
-          <w14:ligatures w14:val="none"/>
-        </w:rPr>
-        <w:t>pochi</w:t>
-      </w:r>
-      <w:proofErr w:type="spellEnd"/>
-      <w:r>
-        <w:rPr>
-          <w:rFonts w:ascii="Cascadia Mono" w:eastAsia="Times New Roman" w:hAnsi="Cascadia Mono" w:cs="Cascadia Mono"/>
-          <w:color w:val="000000"/>
-          <w:kern w:val="0"/>
-          <w:sz w:val="18"/>
-          <w:szCs w:val="18"/>
-          <w:lang w:val="en-BE" w:eastAsia="en-BE"/>
-          <w14:ligatures w14:val="none"/>
-        </w:rPr>
-        <w:t xml:space="preserve"> nodi </w:t>
-      </w:r>
-      <w:proofErr w:type="spellStart"/>
-      <w:r>
-        <w:rPr>
-          <w:rFonts w:ascii="Cascadia Mono" w:eastAsia="Times New Roman" w:hAnsi="Cascadia Mono" w:cs="Cascadia Mono"/>
-          <w:color w:val="000000"/>
-          <w:kern w:val="0"/>
-          <w:sz w:val="18"/>
-          <w:szCs w:val="18"/>
-          <w:lang w:val="en-BE" w:eastAsia="en-BE"/>
-          <w14:ligatures w14:val="none"/>
-        </w:rPr>
-        <w:t>siccome</w:t>
-      </w:r>
-      <w:proofErr w:type="spellEnd"/>
-      <w:r>
-        <w:rPr>
-          <w:rFonts w:ascii="Cascadia Mono" w:eastAsia="Times New Roman" w:hAnsi="Cascadia Mono" w:cs="Cascadia Mono"/>
-          <w:color w:val="000000"/>
-          <w:kern w:val="0"/>
-          <w:sz w:val="18"/>
-          <w:szCs w:val="18"/>
-          <w:lang w:val="en-BE" w:eastAsia="en-BE"/>
-          <w14:ligatures w14:val="none"/>
-        </w:rPr>
-        <w:t xml:space="preserve"> la </w:t>
-      </w:r>
-      <w:proofErr w:type="spellStart"/>
-      <w:r>
-        <w:rPr>
-          <w:rFonts w:ascii="Cascadia Mono" w:eastAsia="Times New Roman" w:hAnsi="Cascadia Mono" w:cs="Cascadia Mono"/>
-          <w:color w:val="000000"/>
-          <w:kern w:val="0"/>
-          <w:sz w:val="18"/>
-          <w:szCs w:val="18"/>
-          <w:lang w:val="en-BE" w:eastAsia="en-BE"/>
-          <w14:ligatures w14:val="none"/>
-        </w:rPr>
-        <w:t>probabilita</w:t>
-      </w:r>
-      <w:proofErr w:type="spellEnd"/>
-      <w:r>
-        <w:rPr>
-          <w:rFonts w:ascii="Cascadia Mono" w:eastAsia="Times New Roman" w:hAnsi="Cascadia Mono" w:cs="Cascadia Mono"/>
-          <w:color w:val="000000"/>
-          <w:kern w:val="0"/>
-          <w:sz w:val="18"/>
-          <w:szCs w:val="18"/>
-          <w:lang w:val="en-BE" w:eastAsia="en-BE"/>
-          <w14:ligatures w14:val="none"/>
-        </w:rPr>
-        <w:t xml:space="preserve">’ </w:t>
-      </w:r>
-      <w:proofErr w:type="spellStart"/>
-      <w:r>
-        <w:rPr>
-          <w:rFonts w:ascii="Cascadia Mono" w:eastAsia="Times New Roman" w:hAnsi="Cascadia Mono" w:cs="Cascadia Mono"/>
-          <w:color w:val="000000"/>
-          <w:kern w:val="0"/>
-          <w:sz w:val="18"/>
-          <w:szCs w:val="18"/>
-          <w:lang w:val="en-BE" w:eastAsia="en-BE"/>
-          <w14:ligatures w14:val="none"/>
-        </w:rPr>
-        <w:t>che</w:t>
-      </w:r>
-      <w:proofErr w:type="spellEnd"/>
-      <w:r>
-        <w:rPr>
-          <w:rFonts w:ascii="Cascadia Mono" w:eastAsia="Times New Roman" w:hAnsi="Cascadia Mono" w:cs="Cascadia Mono"/>
-          <w:color w:val="000000"/>
-          <w:kern w:val="0"/>
-          <w:sz w:val="18"/>
-          <w:szCs w:val="18"/>
-          <w:lang w:val="en-BE" w:eastAsia="en-BE"/>
-          <w14:ligatures w14:val="none"/>
-        </w:rPr>
-        <w:t xml:space="preserve"> </w:t>
-      </w:r>
-      <w:proofErr w:type="spellStart"/>
-      <w:r>
-        <w:rPr>
-          <w:rFonts w:ascii="Cascadia Mono" w:eastAsia="Times New Roman" w:hAnsi="Cascadia Mono" w:cs="Cascadia Mono"/>
-          <w:color w:val="000000"/>
-          <w:kern w:val="0"/>
-          <w:sz w:val="18"/>
-          <w:szCs w:val="18"/>
-          <w:lang w:val="en-BE" w:eastAsia="en-BE"/>
-          <w14:ligatures w14:val="none"/>
-        </w:rPr>
-        <w:t>si</w:t>
-      </w:r>
-      <w:proofErr w:type="spellEnd"/>
-      <w:r>
-        <w:rPr>
-          <w:rFonts w:ascii="Cascadia Mono" w:eastAsia="Times New Roman" w:hAnsi="Cascadia Mono" w:cs="Cascadia Mono"/>
-          <w:color w:val="000000"/>
-          <w:kern w:val="0"/>
-          <w:sz w:val="18"/>
-          <w:szCs w:val="18"/>
-          <w:lang w:val="en-BE" w:eastAsia="en-BE"/>
-          <w14:ligatures w14:val="none"/>
-        </w:rPr>
-        <w:t xml:space="preserve"> </w:t>
-      </w:r>
-      <w:proofErr w:type="spellStart"/>
-      <w:r>
-        <w:rPr>
-          <w:rFonts w:ascii="Cascadia Mono" w:eastAsia="Times New Roman" w:hAnsi="Cascadia Mono" w:cs="Cascadia Mono"/>
-          <w:color w:val="000000"/>
-          <w:kern w:val="0"/>
-          <w:sz w:val="18"/>
-          <w:szCs w:val="18"/>
-          <w:lang w:val="en-BE" w:eastAsia="en-BE"/>
-          <w14:ligatures w14:val="none"/>
-        </w:rPr>
-        <w:t>debba</w:t>
-      </w:r>
-      <w:proofErr w:type="spellEnd"/>
-      <w:r>
-        <w:rPr>
-          <w:rFonts w:ascii="Cascadia Mono" w:eastAsia="Times New Roman" w:hAnsi="Cascadia Mono" w:cs="Cascadia Mono"/>
-          <w:color w:val="000000"/>
-          <w:kern w:val="0"/>
-          <w:sz w:val="18"/>
-          <w:szCs w:val="18"/>
-          <w:lang w:val="en-BE" w:eastAsia="en-BE"/>
-          <w14:ligatures w14:val="none"/>
-        </w:rPr>
-        <w:t xml:space="preserve"> </w:t>
-      </w:r>
-      <w:proofErr w:type="spellStart"/>
-      <w:r>
-        <w:rPr>
-          <w:rFonts w:ascii="Cascadia Mono" w:eastAsia="Times New Roman" w:hAnsi="Cascadia Mono" w:cs="Cascadia Mono"/>
-          <w:color w:val="000000"/>
-          <w:kern w:val="0"/>
-          <w:sz w:val="18"/>
-          <w:szCs w:val="18"/>
-          <w:lang w:val="en-BE" w:eastAsia="en-BE"/>
-          <w14:ligatures w14:val="none"/>
-        </w:rPr>
-        <w:t>inserire</w:t>
-      </w:r>
-      <w:proofErr w:type="spellEnd"/>
-      <w:r>
-        <w:rPr>
-          <w:rFonts w:ascii="Cascadia Mono" w:eastAsia="Times New Roman" w:hAnsi="Cascadia Mono" w:cs="Cascadia Mono"/>
-          <w:color w:val="000000"/>
-          <w:kern w:val="0"/>
-          <w:sz w:val="18"/>
-          <w:szCs w:val="18"/>
-          <w:lang w:val="en-BE" w:eastAsia="en-BE"/>
-          <w14:ligatures w14:val="none"/>
-        </w:rPr>
-        <w:t xml:space="preserve"> il </w:t>
-      </w:r>
-      <w:proofErr w:type="spellStart"/>
-      <w:r>
-        <w:rPr>
-          <w:rFonts w:ascii="Cascadia Mono" w:eastAsia="Times New Roman" w:hAnsi="Cascadia Mono" w:cs="Cascadia Mono"/>
-          <w:color w:val="000000"/>
-          <w:kern w:val="0"/>
-          <w:sz w:val="18"/>
-          <w:szCs w:val="18"/>
-          <w:lang w:val="en-BE" w:eastAsia="en-BE"/>
-          <w14:ligatures w14:val="none"/>
-        </w:rPr>
-        <w:t>nodo</w:t>
-      </w:r>
-      <w:proofErr w:type="spellEnd"/>
-      <w:r>
-        <w:rPr>
-          <w:rFonts w:ascii="Cascadia Mono" w:eastAsia="Times New Roman" w:hAnsi="Cascadia Mono" w:cs="Cascadia Mono"/>
-          <w:color w:val="000000"/>
-          <w:kern w:val="0"/>
-          <w:sz w:val="18"/>
-          <w:szCs w:val="18"/>
-          <w:lang w:val="en-BE" w:eastAsia="en-BE"/>
-          <w14:ligatures w14:val="none"/>
-        </w:rPr>
-        <w:t xml:space="preserve"> e’ %2, e </w:t>
-      </w:r>
-      <w:proofErr w:type="spellStart"/>
-      <w:r>
-        <w:rPr>
-          <w:rFonts w:ascii="Cascadia Mono" w:eastAsia="Times New Roman" w:hAnsi="Cascadia Mono" w:cs="Cascadia Mono"/>
-          <w:color w:val="000000"/>
-          <w:kern w:val="0"/>
-          <w:sz w:val="18"/>
-          <w:szCs w:val="18"/>
-          <w:lang w:val="en-BE" w:eastAsia="en-BE"/>
-          <w14:ligatures w14:val="none"/>
-        </w:rPr>
-        <w:t>probabile</w:t>
-      </w:r>
-      <w:proofErr w:type="spellEnd"/>
-      <w:r>
-        <w:rPr>
-          <w:rFonts w:ascii="Cascadia Mono" w:eastAsia="Times New Roman" w:hAnsi="Cascadia Mono" w:cs="Cascadia Mono"/>
-          <w:color w:val="000000"/>
-          <w:kern w:val="0"/>
-          <w:sz w:val="18"/>
-          <w:szCs w:val="18"/>
-          <w:lang w:val="en-BE" w:eastAsia="en-BE"/>
-          <w14:ligatures w14:val="none"/>
-        </w:rPr>
-        <w:t xml:space="preserve"> </w:t>
-      </w:r>
-      <w:proofErr w:type="spellStart"/>
-      <w:r>
-        <w:rPr>
-          <w:rFonts w:ascii="Cascadia Mono" w:eastAsia="Times New Roman" w:hAnsi="Cascadia Mono" w:cs="Cascadia Mono"/>
-          <w:color w:val="000000"/>
-          <w:kern w:val="0"/>
-          <w:sz w:val="18"/>
-          <w:szCs w:val="18"/>
-          <w:lang w:val="en-BE" w:eastAsia="en-BE"/>
-          <w14:ligatures w14:val="none"/>
-        </w:rPr>
-        <w:t>che</w:t>
-      </w:r>
-      <w:proofErr w:type="spellEnd"/>
-      <w:r>
-        <w:rPr>
-          <w:rFonts w:ascii="Cascadia Mono" w:eastAsia="Times New Roman" w:hAnsi="Cascadia Mono" w:cs="Cascadia Mono"/>
-          <w:color w:val="000000"/>
-          <w:kern w:val="0"/>
-          <w:sz w:val="18"/>
-          <w:szCs w:val="18"/>
-          <w:lang w:val="en-BE" w:eastAsia="en-BE"/>
-          <w14:ligatures w14:val="none"/>
-        </w:rPr>
-        <w:t xml:space="preserve"> </w:t>
-      </w:r>
-      <w:proofErr w:type="spellStart"/>
-      <w:r>
-        <w:rPr>
-          <w:rFonts w:ascii="Cascadia Mono" w:eastAsia="Times New Roman" w:hAnsi="Cascadia Mono" w:cs="Cascadia Mono"/>
-          <w:color w:val="000000"/>
-          <w:kern w:val="0"/>
-          <w:sz w:val="18"/>
-          <w:szCs w:val="18"/>
-          <w:lang w:val="en-BE" w:eastAsia="en-BE"/>
-          <w14:ligatures w14:val="none"/>
-        </w:rPr>
-        <w:t>questi</w:t>
-      </w:r>
-      <w:proofErr w:type="spellEnd"/>
-      <w:r>
-        <w:rPr>
-          <w:rFonts w:ascii="Cascadia Mono" w:eastAsia="Times New Roman" w:hAnsi="Cascadia Mono" w:cs="Cascadia Mono"/>
-          <w:color w:val="000000"/>
-          <w:kern w:val="0"/>
-          <w:sz w:val="18"/>
-          <w:szCs w:val="18"/>
-          <w:lang w:val="en-BE" w:eastAsia="en-BE"/>
-          <w14:ligatures w14:val="none"/>
-        </w:rPr>
-        <w:t xml:space="preserve"> k </w:t>
-      </w:r>
-      <w:proofErr w:type="spellStart"/>
-      <w:r>
-        <w:rPr>
-          <w:rFonts w:ascii="Cascadia Mono" w:eastAsia="Times New Roman" w:hAnsi="Cascadia Mono" w:cs="Cascadia Mono"/>
-          <w:color w:val="000000"/>
-          <w:kern w:val="0"/>
-          <w:sz w:val="18"/>
-          <w:szCs w:val="18"/>
-          <w:lang w:val="en-BE" w:eastAsia="en-BE"/>
-          <w14:ligatures w14:val="none"/>
-        </w:rPr>
-        <w:t>archi</w:t>
-      </w:r>
-      <w:proofErr w:type="spellEnd"/>
-      <w:r>
-        <w:rPr>
-          <w:rFonts w:ascii="Cascadia Mono" w:eastAsia="Times New Roman" w:hAnsi="Cascadia Mono" w:cs="Cascadia Mono"/>
-          <w:color w:val="000000"/>
-          <w:kern w:val="0"/>
-          <w:sz w:val="18"/>
-          <w:szCs w:val="18"/>
-          <w:lang w:val="en-BE" w:eastAsia="en-BE"/>
-          <w14:ligatures w14:val="none"/>
-        </w:rPr>
-        <w:t xml:space="preserve"> </w:t>
-      </w:r>
-      <w:proofErr w:type="spellStart"/>
-      <w:r>
-        <w:rPr>
-          <w:rFonts w:ascii="Cascadia Mono" w:eastAsia="Times New Roman" w:hAnsi="Cascadia Mono" w:cs="Cascadia Mono"/>
-          <w:color w:val="000000"/>
-          <w:kern w:val="0"/>
-          <w:sz w:val="18"/>
-          <w:szCs w:val="18"/>
-          <w:lang w:val="en-BE" w:eastAsia="en-BE"/>
-          <w14:ligatures w14:val="none"/>
-        </w:rPr>
-        <w:t>si</w:t>
-      </w:r>
-      <w:proofErr w:type="spellEnd"/>
-      <w:r>
-        <w:rPr>
-          <w:rFonts w:ascii="Cascadia Mono" w:eastAsia="Times New Roman" w:hAnsi="Cascadia Mono" w:cs="Cascadia Mono"/>
-          <w:color w:val="000000"/>
-          <w:kern w:val="0"/>
-          <w:sz w:val="18"/>
-          <w:szCs w:val="18"/>
-          <w:lang w:val="en-BE" w:eastAsia="en-BE"/>
-          <w14:ligatures w14:val="none"/>
-        </w:rPr>
-        <w:t xml:space="preserve"> </w:t>
-      </w:r>
-      <w:proofErr w:type="spellStart"/>
-      <w:r>
-        <w:rPr>
-          <w:rFonts w:ascii="Cascadia Mono" w:eastAsia="Times New Roman" w:hAnsi="Cascadia Mono" w:cs="Cascadia Mono"/>
-          <w:color w:val="000000"/>
-          <w:kern w:val="0"/>
-          <w:sz w:val="18"/>
-          <w:szCs w:val="18"/>
-          <w:lang w:val="en-BE" w:eastAsia="en-BE"/>
-          <w14:ligatures w14:val="none"/>
-        </w:rPr>
-        <w:t>saturino</w:t>
-      </w:r>
-      <w:proofErr w:type="spellEnd"/>
-      <w:r>
-        <w:rPr>
-          <w:rFonts w:ascii="Cascadia Mono" w:eastAsia="Times New Roman" w:hAnsi="Cascadia Mono" w:cs="Cascadia Mono"/>
-          <w:color w:val="000000"/>
-          <w:kern w:val="0"/>
-          <w:sz w:val="18"/>
-          <w:szCs w:val="18"/>
-          <w:lang w:val="en-BE" w:eastAsia="en-BE"/>
-          <w14:ligatures w14:val="none"/>
-        </w:rPr>
-        <w:t xml:space="preserve"> prima di </w:t>
-      </w:r>
-      <w:proofErr w:type="spellStart"/>
-      <w:r>
-        <w:rPr>
-          <w:rFonts w:ascii="Cascadia Mono" w:eastAsia="Times New Roman" w:hAnsi="Cascadia Mono" w:cs="Cascadia Mono"/>
-          <w:color w:val="000000"/>
-          <w:kern w:val="0"/>
-          <w:sz w:val="18"/>
-          <w:szCs w:val="18"/>
-          <w:lang w:val="en-BE" w:eastAsia="en-BE"/>
-          <w14:ligatures w14:val="none"/>
-        </w:rPr>
-        <w:t>raggiungere</w:t>
-      </w:r>
-      <w:proofErr w:type="spellEnd"/>
-      <w:r>
-        <w:rPr>
-          <w:rFonts w:ascii="Cascadia Mono" w:eastAsia="Times New Roman" w:hAnsi="Cascadia Mono" w:cs="Cascadia Mono"/>
-          <w:color w:val="000000"/>
-          <w:kern w:val="0"/>
-          <w:sz w:val="18"/>
-          <w:szCs w:val="18"/>
-          <w:lang w:val="en-BE" w:eastAsia="en-BE"/>
-          <w14:ligatures w14:val="none"/>
-        </w:rPr>
-        <w:t xml:space="preserve"> un j grande (es. Grafi con k =5 </w:t>
-      </w:r>
-      <w:proofErr w:type="spellStart"/>
-      <w:r>
-        <w:rPr>
-          <w:rFonts w:ascii="Cascadia Mono" w:eastAsia="Times New Roman" w:hAnsi="Cascadia Mono" w:cs="Cascadia Mono"/>
-          <w:color w:val="000000"/>
-          <w:kern w:val="0"/>
-          <w:sz w:val="18"/>
-          <w:szCs w:val="18"/>
-          <w:lang w:val="en-BE" w:eastAsia="en-BE"/>
-          <w14:ligatures w14:val="none"/>
-        </w:rPr>
-        <w:t>archi</w:t>
-      </w:r>
-      <w:proofErr w:type="spellEnd"/>
-      <w:r>
-        <w:rPr>
-          <w:rFonts w:ascii="Cascadia Mono" w:eastAsia="Times New Roman" w:hAnsi="Cascadia Mono" w:cs="Cascadia Mono"/>
-          <w:color w:val="000000"/>
-          <w:kern w:val="0"/>
-          <w:sz w:val="18"/>
-          <w:szCs w:val="18"/>
-          <w:lang w:val="en-BE" w:eastAsia="en-BE"/>
-          <w14:ligatures w14:val="none"/>
-        </w:rPr>
-        <w:t xml:space="preserve"> </w:t>
-      </w:r>
-      <w:proofErr w:type="spellStart"/>
-      <w:r>
-        <w:rPr>
-          <w:rFonts w:ascii="Cascadia Mono" w:eastAsia="Times New Roman" w:hAnsi="Cascadia Mono" w:cs="Cascadia Mono"/>
-          <w:color w:val="000000"/>
-          <w:kern w:val="0"/>
-          <w:sz w:val="18"/>
-          <w:szCs w:val="18"/>
-          <w:lang w:val="en-BE" w:eastAsia="en-BE"/>
-          <w14:ligatures w14:val="none"/>
-        </w:rPr>
-        <w:t>uscenti</w:t>
-      </w:r>
-      <w:proofErr w:type="spellEnd"/>
-      <w:r>
-        <w:rPr>
-          <w:rFonts w:ascii="Cascadia Mono" w:eastAsia="Times New Roman" w:hAnsi="Cascadia Mono" w:cs="Cascadia Mono"/>
-          <w:color w:val="000000"/>
-          <w:kern w:val="0"/>
-          <w:sz w:val="18"/>
-          <w:szCs w:val="18"/>
-          <w:lang w:val="en-BE" w:eastAsia="en-BE"/>
-          <w14:ligatures w14:val="none"/>
-        </w:rPr>
-        <w:t xml:space="preserve"> max </w:t>
-      </w:r>
-      <w:proofErr w:type="spellStart"/>
-      <w:r>
-        <w:rPr>
-          <w:rFonts w:ascii="Cascadia Mono" w:eastAsia="Times New Roman" w:hAnsi="Cascadia Mono" w:cs="Cascadia Mono"/>
-          <w:color w:val="000000"/>
-          <w:kern w:val="0"/>
-          <w:sz w:val="18"/>
-          <w:szCs w:val="18"/>
-          <w:lang w:val="en-BE" w:eastAsia="en-BE"/>
-          <w14:ligatures w14:val="none"/>
-        </w:rPr>
-        <w:t>enVertici</w:t>
-      </w:r>
-      <w:proofErr w:type="spellEnd"/>
-      <w:r>
-        <w:rPr>
-          <w:rFonts w:ascii="Cascadia Mono" w:eastAsia="Times New Roman" w:hAnsi="Cascadia Mono" w:cs="Cascadia Mono"/>
-          <w:color w:val="000000"/>
-          <w:kern w:val="0"/>
-          <w:sz w:val="18"/>
-          <w:szCs w:val="18"/>
-          <w:lang w:val="en-BE" w:eastAsia="en-BE"/>
-          <w14:ligatures w14:val="none"/>
-        </w:rPr>
-        <w:t xml:space="preserve"> = 50), e’ facile </w:t>
-      </w:r>
-      <w:proofErr w:type="spellStart"/>
-      <w:r>
-        <w:rPr>
-          <w:rFonts w:ascii="Cascadia Mono" w:eastAsia="Times New Roman" w:hAnsi="Cascadia Mono" w:cs="Cascadia Mono"/>
-          <w:color w:val="000000"/>
-          <w:kern w:val="0"/>
-          <w:sz w:val="18"/>
-          <w:szCs w:val="18"/>
-          <w:lang w:val="en-BE" w:eastAsia="en-BE"/>
-          <w14:ligatures w14:val="none"/>
-        </w:rPr>
-        <w:t>capire</w:t>
-      </w:r>
-      <w:proofErr w:type="spellEnd"/>
-      <w:r>
-        <w:rPr>
-          <w:rFonts w:ascii="Cascadia Mono" w:eastAsia="Times New Roman" w:hAnsi="Cascadia Mono" w:cs="Cascadia Mono"/>
-          <w:color w:val="000000"/>
-          <w:kern w:val="0"/>
-          <w:sz w:val="18"/>
-          <w:szCs w:val="18"/>
-          <w:lang w:val="en-BE" w:eastAsia="en-BE"/>
-          <w14:ligatures w14:val="none"/>
-        </w:rPr>
-        <w:t xml:space="preserve"> </w:t>
-      </w:r>
-      <w:proofErr w:type="spellStart"/>
-      <w:r>
-        <w:rPr>
-          <w:rFonts w:ascii="Cascadia Mono" w:eastAsia="Times New Roman" w:hAnsi="Cascadia Mono" w:cs="Cascadia Mono"/>
-          <w:color w:val="000000"/>
-          <w:kern w:val="0"/>
-          <w:sz w:val="18"/>
-          <w:szCs w:val="18"/>
-          <w:lang w:val="en-BE" w:eastAsia="en-BE"/>
-          <w14:ligatures w14:val="none"/>
-        </w:rPr>
-        <w:t>che</w:t>
-      </w:r>
-      <w:proofErr w:type="spellEnd"/>
-      <w:r>
-        <w:rPr>
-          <w:rFonts w:ascii="Cascadia Mono" w:eastAsia="Times New Roman" w:hAnsi="Cascadia Mono" w:cs="Cascadia Mono"/>
-          <w:color w:val="000000"/>
-          <w:kern w:val="0"/>
-          <w:sz w:val="18"/>
-          <w:szCs w:val="18"/>
-          <w:lang w:val="en-BE" w:eastAsia="en-BE"/>
-          <w14:ligatures w14:val="none"/>
-        </w:rPr>
-        <w:t xml:space="preserve"> dopo </w:t>
-      </w:r>
-      <w:proofErr w:type="spellStart"/>
-      <w:r>
-        <w:rPr>
-          <w:rFonts w:ascii="Cascadia Mono" w:eastAsia="Times New Roman" w:hAnsi="Cascadia Mono" w:cs="Cascadia Mono"/>
-          <w:color w:val="000000"/>
-          <w:kern w:val="0"/>
-          <w:sz w:val="18"/>
-          <w:szCs w:val="18"/>
-          <w:lang w:val="en-BE" w:eastAsia="en-BE"/>
-          <w14:ligatures w14:val="none"/>
-        </w:rPr>
-        <w:t>massimo</w:t>
-      </w:r>
-      <w:proofErr w:type="spellEnd"/>
-      <w:r>
-        <w:rPr>
-          <w:rFonts w:ascii="Cascadia Mono" w:eastAsia="Times New Roman" w:hAnsi="Cascadia Mono" w:cs="Cascadia Mono"/>
-          <w:color w:val="000000"/>
-          <w:kern w:val="0"/>
-          <w:sz w:val="18"/>
-          <w:szCs w:val="18"/>
-          <w:lang w:val="en-BE" w:eastAsia="en-BE"/>
-          <w14:ligatures w14:val="none"/>
-        </w:rPr>
-        <w:t xml:space="preserve"> </w:t>
-      </w:r>
-      <w:proofErr w:type="spellStart"/>
-      <w:r>
-        <w:rPr>
-          <w:rFonts w:ascii="Cascadia Mono" w:eastAsia="Times New Roman" w:hAnsi="Cascadia Mono" w:cs="Cascadia Mono"/>
-          <w:color w:val="000000"/>
-          <w:kern w:val="0"/>
-          <w:sz w:val="18"/>
-          <w:szCs w:val="18"/>
-          <w:lang w:val="en-BE" w:eastAsia="en-BE"/>
-          <w14:ligatures w14:val="none"/>
-        </w:rPr>
-        <w:t>una</w:t>
-      </w:r>
-      <w:proofErr w:type="spellEnd"/>
-      <w:r>
-        <w:rPr>
-          <w:rFonts w:ascii="Cascadia Mono" w:eastAsia="Times New Roman" w:hAnsi="Cascadia Mono" w:cs="Cascadia Mono"/>
-          <w:color w:val="000000"/>
-          <w:kern w:val="0"/>
-          <w:sz w:val="18"/>
-          <w:szCs w:val="18"/>
-          <w:lang w:val="en-BE" w:eastAsia="en-BE"/>
-          <w14:ligatures w14:val="none"/>
-        </w:rPr>
-        <w:t xml:space="preserve"> </w:t>
-      </w:r>
-      <w:proofErr w:type="spellStart"/>
-      <w:r>
-        <w:rPr>
-          <w:rFonts w:ascii="Cascadia Mono" w:eastAsia="Times New Roman" w:hAnsi="Cascadia Mono" w:cs="Cascadia Mono"/>
-          <w:color w:val="000000"/>
-          <w:kern w:val="0"/>
-          <w:sz w:val="18"/>
-          <w:szCs w:val="18"/>
-          <w:lang w:val="en-BE" w:eastAsia="en-BE"/>
-          <w14:ligatures w14:val="none"/>
-        </w:rPr>
-        <w:t>decina</w:t>
-      </w:r>
-      <w:proofErr w:type="spellEnd"/>
-      <w:r>
-        <w:rPr>
-          <w:rFonts w:ascii="Cascadia Mono" w:eastAsia="Times New Roman" w:hAnsi="Cascadia Mono" w:cs="Cascadia Mono"/>
-          <w:color w:val="000000"/>
-          <w:kern w:val="0"/>
-          <w:sz w:val="18"/>
-          <w:szCs w:val="18"/>
-          <w:lang w:val="en-BE" w:eastAsia="en-BE"/>
-          <w14:ligatures w14:val="none"/>
-        </w:rPr>
-        <w:t xml:space="preserve"> di </w:t>
-      </w:r>
-      <w:proofErr w:type="spellStart"/>
-      <w:r>
-        <w:rPr>
-          <w:rFonts w:ascii="Cascadia Mono" w:eastAsia="Times New Roman" w:hAnsi="Cascadia Mono" w:cs="Cascadia Mono"/>
-          <w:color w:val="000000"/>
-          <w:kern w:val="0"/>
-          <w:sz w:val="18"/>
-          <w:szCs w:val="18"/>
-          <w:lang w:val="en-BE" w:eastAsia="en-BE"/>
-          <w14:ligatures w14:val="none"/>
-        </w:rPr>
-        <w:t>iterazoni</w:t>
-      </w:r>
-      <w:proofErr w:type="spellEnd"/>
-      <w:r>
-        <w:rPr>
-          <w:rFonts w:ascii="Cascadia Mono" w:eastAsia="Times New Roman" w:hAnsi="Cascadia Mono" w:cs="Cascadia Mono"/>
-          <w:color w:val="000000"/>
-          <w:kern w:val="0"/>
-          <w:sz w:val="18"/>
-          <w:szCs w:val="18"/>
-          <w:lang w:val="en-BE" w:eastAsia="en-BE"/>
-          <w14:ligatures w14:val="none"/>
-        </w:rPr>
-        <w:t xml:space="preserve"> </w:t>
-      </w:r>
-      <w:proofErr w:type="spellStart"/>
-      <w:r>
-        <w:rPr>
-          <w:rFonts w:ascii="Cascadia Mono" w:eastAsia="Times New Roman" w:hAnsi="Cascadia Mono" w:cs="Cascadia Mono"/>
-          <w:color w:val="000000"/>
-          <w:kern w:val="0"/>
-          <w:sz w:val="18"/>
-          <w:szCs w:val="18"/>
-          <w:lang w:val="en-BE" w:eastAsia="en-BE"/>
-          <w14:ligatures w14:val="none"/>
-        </w:rPr>
-        <w:t>si</w:t>
-      </w:r>
-      <w:proofErr w:type="spellEnd"/>
-      <w:r>
-        <w:rPr>
-          <w:rFonts w:ascii="Cascadia Mono" w:eastAsia="Times New Roman" w:hAnsi="Cascadia Mono" w:cs="Cascadia Mono"/>
-          <w:color w:val="000000"/>
-          <w:kern w:val="0"/>
-          <w:sz w:val="18"/>
-          <w:szCs w:val="18"/>
-          <w:lang w:val="en-BE" w:eastAsia="en-BE"/>
-          <w14:ligatures w14:val="none"/>
-        </w:rPr>
-        <w:t xml:space="preserve"> </w:t>
-      </w:r>
-      <w:proofErr w:type="spellStart"/>
-      <w:r>
-        <w:rPr>
-          <w:rFonts w:ascii="Cascadia Mono" w:eastAsia="Times New Roman" w:hAnsi="Cascadia Mono" w:cs="Cascadia Mono"/>
-          <w:color w:val="000000"/>
-          <w:kern w:val="0"/>
-          <w:sz w:val="18"/>
-          <w:szCs w:val="18"/>
-          <w:lang w:val="en-BE" w:eastAsia="en-BE"/>
-          <w14:ligatures w14:val="none"/>
-        </w:rPr>
-        <w:t>saranno</w:t>
-      </w:r>
-      <w:proofErr w:type="spellEnd"/>
-      <w:r>
-        <w:rPr>
-          <w:rFonts w:ascii="Cascadia Mono" w:eastAsia="Times New Roman" w:hAnsi="Cascadia Mono" w:cs="Cascadia Mono"/>
-          <w:color w:val="000000"/>
-          <w:kern w:val="0"/>
-          <w:sz w:val="18"/>
-          <w:szCs w:val="18"/>
-          <w:lang w:val="en-BE" w:eastAsia="en-BE"/>
-          <w14:ligatures w14:val="none"/>
-        </w:rPr>
-        <w:t xml:space="preserve"> </w:t>
-      </w:r>
-      <w:proofErr w:type="spellStart"/>
-      <w:r>
-        <w:rPr>
-          <w:rFonts w:ascii="Cascadia Mono" w:eastAsia="Times New Roman" w:hAnsi="Cascadia Mono" w:cs="Cascadia Mono"/>
-          <w:color w:val="000000"/>
-          <w:kern w:val="0"/>
-          <w:sz w:val="18"/>
-          <w:szCs w:val="18"/>
-          <w:lang w:val="en-BE" w:eastAsia="en-BE"/>
-          <w14:ligatures w14:val="none"/>
-        </w:rPr>
-        <w:t>gia</w:t>
-      </w:r>
-      <w:proofErr w:type="spellEnd"/>
-      <w:r>
-        <w:rPr>
-          <w:rFonts w:ascii="Cascadia Mono" w:eastAsia="Times New Roman" w:hAnsi="Cascadia Mono" w:cs="Cascadia Mono"/>
-          <w:color w:val="000000"/>
-          <w:kern w:val="0"/>
-          <w:sz w:val="18"/>
-          <w:szCs w:val="18"/>
-          <w:lang w:val="en-BE" w:eastAsia="en-BE"/>
-          <w14:ligatures w14:val="none"/>
-        </w:rPr>
-        <w:t xml:space="preserve">’ </w:t>
-      </w:r>
-      <w:proofErr w:type="spellStart"/>
-      <w:r>
-        <w:rPr>
-          <w:rFonts w:ascii="Cascadia Mono" w:eastAsia="Times New Roman" w:hAnsi="Cascadia Mono" w:cs="Cascadia Mono"/>
-          <w:color w:val="000000"/>
-          <w:kern w:val="0"/>
-          <w:sz w:val="18"/>
-          <w:szCs w:val="18"/>
-          <w:lang w:val="en-BE" w:eastAsia="en-BE"/>
-          <w14:ligatures w14:val="none"/>
-        </w:rPr>
-        <w:t>consumati</w:t>
-      </w:r>
-      <w:proofErr w:type="spellEnd"/>
-      <w:r>
-        <w:rPr>
-          <w:rFonts w:ascii="Cascadia Mono" w:eastAsia="Times New Roman" w:hAnsi="Cascadia Mono" w:cs="Cascadia Mono"/>
-          <w:color w:val="000000"/>
-          <w:kern w:val="0"/>
-          <w:sz w:val="18"/>
-          <w:szCs w:val="18"/>
-          <w:lang w:val="en-BE" w:eastAsia="en-BE"/>
-          <w14:ligatures w14:val="none"/>
-        </w:rPr>
-        <w:t xml:space="preserve"> </w:t>
-      </w:r>
-      <w:proofErr w:type="spellStart"/>
-      <w:r>
-        <w:rPr>
-          <w:rFonts w:ascii="Cascadia Mono" w:eastAsia="Times New Roman" w:hAnsi="Cascadia Mono" w:cs="Cascadia Mono"/>
-          <w:color w:val="000000"/>
-          <w:kern w:val="0"/>
-          <w:sz w:val="18"/>
-          <w:szCs w:val="18"/>
-          <w:lang w:val="en-BE" w:eastAsia="en-BE"/>
-          <w14:ligatures w14:val="none"/>
-        </w:rPr>
-        <w:t>gli</w:t>
-      </w:r>
-      <w:proofErr w:type="spellEnd"/>
-      <w:r>
-        <w:rPr>
-          <w:rFonts w:ascii="Cascadia Mono" w:eastAsia="Times New Roman" w:hAnsi="Cascadia Mono" w:cs="Cascadia Mono"/>
-          <w:color w:val="000000"/>
-          <w:kern w:val="0"/>
-          <w:sz w:val="18"/>
-          <w:szCs w:val="18"/>
-          <w:lang w:val="en-BE" w:eastAsia="en-BE"/>
-          <w14:ligatures w14:val="none"/>
-        </w:rPr>
-        <w:t xml:space="preserve"> </w:t>
-      </w:r>
-      <w:proofErr w:type="spellStart"/>
-      <w:r>
-        <w:rPr>
-          <w:rFonts w:ascii="Cascadia Mono" w:eastAsia="Times New Roman" w:hAnsi="Cascadia Mono" w:cs="Cascadia Mono"/>
-          <w:color w:val="000000"/>
-          <w:kern w:val="0"/>
-          <w:sz w:val="18"/>
-          <w:szCs w:val="18"/>
-          <w:lang w:val="en-BE" w:eastAsia="en-BE"/>
-          <w14:ligatures w14:val="none"/>
-        </w:rPr>
-        <w:t>archi</w:t>
-      </w:r>
-      <w:proofErr w:type="spellEnd"/>
-      <w:r>
-        <w:rPr>
-          <w:rFonts w:ascii="Cascadia Mono" w:eastAsia="Times New Roman" w:hAnsi="Cascadia Mono" w:cs="Cascadia Mono"/>
-          <w:color w:val="000000"/>
-          <w:kern w:val="0"/>
-          <w:sz w:val="18"/>
-          <w:szCs w:val="18"/>
-          <w:lang w:val="en-BE" w:eastAsia="en-BE"/>
-          <w14:ligatures w14:val="none"/>
-        </w:rPr>
-        <w:t>.</w:t>
+        <w:t xml:space="preserve"> non ottima perche’ funziona solo grafi con pochi nodi siccome la probabilita’ che si debba inserire il nodo e’ %2, e probabile che questi k archi si saturino prima di raggiungere un j grande (es. Grafi con k =5 archi uscenti max enVertici = 50), e’ facile capire che dopo massimo una decina di iterazoni si saranno gia’ consumati gli archi.</w:t>
       </w:r>
     </w:p>
     <w:p>
@@ -2743,499 +1446,17 @@
           <w14:ligatures w14:val="none"/>
         </w:rPr>
       </w:pPr>
-      <w:proofErr w:type="spellStart"/>
-      <w:r>
-        <w:rPr>
-          <w:rFonts w:ascii="Cascadia Mono" w:eastAsia="Times New Roman" w:hAnsi="Cascadia Mono" w:cs="Cascadia Mono"/>
-          <w:color w:val="000000"/>
-          <w:kern w:val="0"/>
-          <w:sz w:val="18"/>
-          <w:szCs w:val="18"/>
-          <w:lang w:val="en-BE" w:eastAsia="en-BE"/>
-          <w14:ligatures w14:val="none"/>
-        </w:rPr>
-        <w:t>Comunque</w:t>
-      </w:r>
-      <w:proofErr w:type="spellEnd"/>
-      <w:r>
-        <w:rPr>
-          <w:rFonts w:ascii="Cascadia Mono" w:eastAsia="Times New Roman" w:hAnsi="Cascadia Mono" w:cs="Cascadia Mono"/>
-          <w:color w:val="000000"/>
-          <w:kern w:val="0"/>
-          <w:sz w:val="18"/>
-          <w:szCs w:val="18"/>
-          <w:lang w:val="en-BE" w:eastAsia="en-BE"/>
-          <w14:ligatures w14:val="none"/>
-        </w:rPr>
-        <w:t xml:space="preserve"> a </w:t>
-      </w:r>
-      <w:proofErr w:type="spellStart"/>
-      <w:r>
-        <w:rPr>
-          <w:rFonts w:ascii="Cascadia Mono" w:eastAsia="Times New Roman" w:hAnsi="Cascadia Mono" w:cs="Cascadia Mono"/>
-          <w:color w:val="000000"/>
-          <w:kern w:val="0"/>
-          <w:sz w:val="18"/>
-          <w:szCs w:val="18"/>
-          <w:lang w:val="en-BE" w:eastAsia="en-BE"/>
-          <w14:ligatures w14:val="none"/>
-        </w:rPr>
-        <w:t>prescindere</w:t>
-      </w:r>
-      <w:proofErr w:type="spellEnd"/>
-      <w:r>
-        <w:rPr>
-          <w:rFonts w:ascii="Cascadia Mono" w:eastAsia="Times New Roman" w:hAnsi="Cascadia Mono" w:cs="Cascadia Mono"/>
-          <w:color w:val="000000"/>
-          <w:kern w:val="0"/>
-          <w:sz w:val="18"/>
-          <w:szCs w:val="18"/>
-          <w:lang w:val="en-BE" w:eastAsia="en-BE"/>
-          <w14:ligatures w14:val="none"/>
-        </w:rPr>
-        <w:t xml:space="preserve"> </w:t>
-      </w:r>
-      <w:proofErr w:type="spellStart"/>
-      <w:r>
-        <w:rPr>
-          <w:rFonts w:ascii="Cascadia Mono" w:eastAsia="Times New Roman" w:hAnsi="Cascadia Mono" w:cs="Cascadia Mono"/>
-          <w:color w:val="000000"/>
-          <w:kern w:val="0"/>
-          <w:sz w:val="18"/>
-          <w:szCs w:val="18"/>
-          <w:lang w:val="en-BE" w:eastAsia="en-BE"/>
-          <w14:ligatures w14:val="none"/>
-        </w:rPr>
-        <w:t>dalla</w:t>
-      </w:r>
-      <w:proofErr w:type="spellEnd"/>
-      <w:r>
-        <w:rPr>
-          <w:rFonts w:ascii="Cascadia Mono" w:eastAsia="Times New Roman" w:hAnsi="Cascadia Mono" w:cs="Cascadia Mono"/>
-          <w:color w:val="000000"/>
-          <w:kern w:val="0"/>
-          <w:sz w:val="18"/>
-          <w:szCs w:val="18"/>
-          <w:lang w:val="en-BE" w:eastAsia="en-BE"/>
-          <w14:ligatures w14:val="none"/>
-        </w:rPr>
-        <w:t xml:space="preserve"> </w:t>
-      </w:r>
-      <w:proofErr w:type="spellStart"/>
-      <w:r>
-        <w:rPr>
-          <w:rFonts w:ascii="Cascadia Mono" w:eastAsia="Times New Roman" w:hAnsi="Cascadia Mono" w:cs="Cascadia Mono"/>
-          <w:color w:val="000000"/>
-          <w:kern w:val="0"/>
-          <w:sz w:val="18"/>
-          <w:szCs w:val="18"/>
-          <w:lang w:val="en-BE" w:eastAsia="en-BE"/>
-          <w14:ligatures w14:val="none"/>
-        </w:rPr>
-        <w:t>ottimizzazione</w:t>
-      </w:r>
-      <w:proofErr w:type="spellEnd"/>
-      <w:r>
-        <w:rPr>
-          <w:rFonts w:ascii="Cascadia Mono" w:eastAsia="Times New Roman" w:hAnsi="Cascadia Mono" w:cs="Cascadia Mono"/>
-          <w:color w:val="000000"/>
-          <w:kern w:val="0"/>
-          <w:sz w:val="18"/>
-          <w:szCs w:val="18"/>
-          <w:lang w:val="en-BE" w:eastAsia="en-BE"/>
-          <w14:ligatures w14:val="none"/>
-        </w:rPr>
-        <w:t xml:space="preserve"> e’ un </w:t>
-      </w:r>
-      <w:proofErr w:type="spellStart"/>
-      <w:r>
-        <w:rPr>
-          <w:rFonts w:ascii="Cascadia Mono" w:eastAsia="Times New Roman" w:hAnsi="Cascadia Mono" w:cs="Cascadia Mono"/>
-          <w:color w:val="000000"/>
-          <w:kern w:val="0"/>
-          <w:sz w:val="18"/>
-          <w:szCs w:val="18"/>
-          <w:lang w:val="en-BE" w:eastAsia="en-BE"/>
-          <w14:ligatures w14:val="none"/>
-        </w:rPr>
-        <w:t>procesimento</w:t>
-      </w:r>
-      <w:proofErr w:type="spellEnd"/>
-      <w:r>
-        <w:rPr>
-          <w:rFonts w:ascii="Cascadia Mono" w:eastAsia="Times New Roman" w:hAnsi="Cascadia Mono" w:cs="Cascadia Mono"/>
-          <w:color w:val="000000"/>
-          <w:kern w:val="0"/>
-          <w:sz w:val="18"/>
-          <w:szCs w:val="18"/>
-          <w:lang w:val="en-BE" w:eastAsia="en-BE"/>
-          <w14:ligatures w14:val="none"/>
-        </w:rPr>
-        <w:t xml:space="preserve"> molto semplice, per </w:t>
-      </w:r>
-      <w:proofErr w:type="spellStart"/>
-      <w:r>
-        <w:rPr>
-          <w:rFonts w:ascii="Cascadia Mono" w:eastAsia="Times New Roman" w:hAnsi="Cascadia Mono" w:cs="Cascadia Mono"/>
-          <w:color w:val="000000"/>
-          <w:kern w:val="0"/>
-          <w:sz w:val="18"/>
-          <w:szCs w:val="18"/>
-          <w:lang w:val="en-BE" w:eastAsia="en-BE"/>
-          <w14:ligatures w14:val="none"/>
-        </w:rPr>
-        <w:t>ciascun</w:t>
-      </w:r>
-      <w:proofErr w:type="spellEnd"/>
-      <w:r>
-        <w:rPr>
-          <w:rFonts w:ascii="Cascadia Mono" w:eastAsia="Times New Roman" w:hAnsi="Cascadia Mono" w:cs="Cascadia Mono"/>
-          <w:color w:val="000000"/>
-          <w:kern w:val="0"/>
-          <w:sz w:val="18"/>
-          <w:szCs w:val="18"/>
-          <w:lang w:val="en-BE" w:eastAsia="en-BE"/>
-          <w14:ligatures w14:val="none"/>
-        </w:rPr>
-        <w:t xml:space="preserve"> </w:t>
-      </w:r>
-      <w:proofErr w:type="spellStart"/>
-      <w:r>
-        <w:rPr>
-          <w:rFonts w:ascii="Cascadia Mono" w:eastAsia="Times New Roman" w:hAnsi="Cascadia Mono" w:cs="Cascadia Mono"/>
-          <w:color w:val="000000"/>
-          <w:kern w:val="0"/>
-          <w:sz w:val="18"/>
-          <w:szCs w:val="18"/>
-          <w:lang w:val="en-BE" w:eastAsia="en-BE"/>
-          <w14:ligatures w14:val="none"/>
-        </w:rPr>
-        <w:t>nodo</w:t>
-      </w:r>
-      <w:proofErr w:type="spellEnd"/>
-      <w:r>
-        <w:rPr>
-          <w:rFonts w:ascii="Cascadia Mono" w:eastAsia="Times New Roman" w:hAnsi="Cascadia Mono" w:cs="Cascadia Mono"/>
-          <w:color w:val="000000"/>
-          <w:kern w:val="0"/>
-          <w:sz w:val="18"/>
-          <w:szCs w:val="18"/>
-          <w:lang w:val="en-BE" w:eastAsia="en-BE"/>
-          <w14:ligatures w14:val="none"/>
-        </w:rPr>
-        <w:t xml:space="preserve"> </w:t>
-      </w:r>
-      <w:proofErr w:type="spellStart"/>
-      <w:r>
-        <w:rPr>
-          <w:rFonts w:ascii="Cascadia Mono" w:eastAsia="Times New Roman" w:hAnsi="Cascadia Mono" w:cs="Cascadia Mono"/>
-          <w:color w:val="000000"/>
-          <w:kern w:val="0"/>
-          <w:sz w:val="18"/>
-          <w:szCs w:val="18"/>
-          <w:lang w:val="en-BE" w:eastAsia="en-BE"/>
-          <w14:ligatures w14:val="none"/>
-        </w:rPr>
-        <w:t>finche</w:t>
-      </w:r>
-      <w:proofErr w:type="spellEnd"/>
-      <w:r>
-        <w:rPr>
-          <w:rFonts w:ascii="Cascadia Mono" w:eastAsia="Times New Roman" w:hAnsi="Cascadia Mono" w:cs="Cascadia Mono"/>
-          <w:color w:val="000000"/>
-          <w:kern w:val="0"/>
-          <w:sz w:val="18"/>
-          <w:szCs w:val="18"/>
-          <w:lang w:val="en-BE" w:eastAsia="en-BE"/>
-          <w14:ligatures w14:val="none"/>
-        </w:rPr>
-        <w:t xml:space="preserve">’ non ha </w:t>
-      </w:r>
-      <w:proofErr w:type="spellStart"/>
-      <w:r>
-        <w:rPr>
-          <w:rFonts w:ascii="Cascadia Mono" w:eastAsia="Times New Roman" w:hAnsi="Cascadia Mono" w:cs="Cascadia Mono"/>
-          <w:color w:val="000000"/>
-          <w:kern w:val="0"/>
-          <w:sz w:val="18"/>
-          <w:szCs w:val="18"/>
-          <w:lang w:val="en-BE" w:eastAsia="en-BE"/>
-          <w14:ligatures w14:val="none"/>
-        </w:rPr>
-        <w:t>esplorato</w:t>
-      </w:r>
-      <w:proofErr w:type="spellEnd"/>
-      <w:r>
-        <w:rPr>
-          <w:rFonts w:ascii="Cascadia Mono" w:eastAsia="Times New Roman" w:hAnsi="Cascadia Mono" w:cs="Cascadia Mono"/>
-          <w:color w:val="000000"/>
-          <w:kern w:val="0"/>
-          <w:sz w:val="18"/>
-          <w:szCs w:val="18"/>
-          <w:lang w:val="en-BE" w:eastAsia="en-BE"/>
-          <w14:ligatures w14:val="none"/>
-        </w:rPr>
-        <w:t xml:space="preserve"> tutti </w:t>
-      </w:r>
-      <w:proofErr w:type="spellStart"/>
-      <w:r>
-        <w:rPr>
-          <w:rFonts w:ascii="Cascadia Mono" w:eastAsia="Times New Roman" w:hAnsi="Cascadia Mono" w:cs="Cascadia Mono"/>
-          <w:color w:val="000000"/>
-          <w:kern w:val="0"/>
-          <w:sz w:val="18"/>
-          <w:szCs w:val="18"/>
-          <w:lang w:val="en-BE" w:eastAsia="en-BE"/>
-          <w14:ligatures w14:val="none"/>
-        </w:rPr>
-        <w:t>gli</w:t>
-      </w:r>
-      <w:proofErr w:type="spellEnd"/>
-      <w:r>
-        <w:rPr>
-          <w:rFonts w:ascii="Cascadia Mono" w:eastAsia="Times New Roman" w:hAnsi="Cascadia Mono" w:cs="Cascadia Mono"/>
-          <w:color w:val="000000"/>
-          <w:kern w:val="0"/>
-          <w:sz w:val="18"/>
-          <w:szCs w:val="18"/>
-          <w:lang w:val="en-BE" w:eastAsia="en-BE"/>
-          <w14:ligatures w14:val="none"/>
-        </w:rPr>
-        <w:t xml:space="preserve"> </w:t>
-      </w:r>
-      <w:proofErr w:type="spellStart"/>
-      <w:r>
-        <w:rPr>
-          <w:rFonts w:ascii="Cascadia Mono" w:eastAsia="Times New Roman" w:hAnsi="Cascadia Mono" w:cs="Cascadia Mono"/>
-          <w:color w:val="000000"/>
-          <w:kern w:val="0"/>
-          <w:sz w:val="18"/>
-          <w:szCs w:val="18"/>
-          <w:lang w:val="en-BE" w:eastAsia="en-BE"/>
-          <w14:ligatures w14:val="none"/>
-        </w:rPr>
-        <w:t>altri</w:t>
-      </w:r>
-      <w:proofErr w:type="spellEnd"/>
-      <w:r>
-        <w:rPr>
-          <w:rFonts w:ascii="Cascadia Mono" w:eastAsia="Times New Roman" w:hAnsi="Cascadia Mono" w:cs="Cascadia Mono"/>
-          <w:color w:val="000000"/>
-          <w:kern w:val="0"/>
-          <w:sz w:val="18"/>
-          <w:szCs w:val="18"/>
-          <w:lang w:val="en-BE" w:eastAsia="en-BE"/>
-          <w14:ligatures w14:val="none"/>
-        </w:rPr>
-        <w:t xml:space="preserve"> nodi o </w:t>
-      </w:r>
-      <w:proofErr w:type="spellStart"/>
-      <w:r>
-        <w:rPr>
-          <w:rFonts w:ascii="Cascadia Mono" w:eastAsia="Times New Roman" w:hAnsi="Cascadia Mono" w:cs="Cascadia Mono"/>
-          <w:color w:val="000000"/>
-          <w:kern w:val="0"/>
-          <w:sz w:val="18"/>
-          <w:szCs w:val="18"/>
-          <w:lang w:val="en-BE" w:eastAsia="en-BE"/>
-          <w14:ligatures w14:val="none"/>
-        </w:rPr>
-        <w:t>saturato</w:t>
-      </w:r>
-      <w:proofErr w:type="spellEnd"/>
-      <w:r>
-        <w:rPr>
-          <w:rFonts w:ascii="Cascadia Mono" w:eastAsia="Times New Roman" w:hAnsi="Cascadia Mono" w:cs="Cascadia Mono"/>
-          <w:color w:val="000000"/>
-          <w:kern w:val="0"/>
-          <w:sz w:val="18"/>
-          <w:szCs w:val="18"/>
-          <w:lang w:val="en-BE" w:eastAsia="en-BE"/>
-          <w14:ligatures w14:val="none"/>
-        </w:rPr>
-        <w:t xml:space="preserve"> </w:t>
-      </w:r>
-      <w:proofErr w:type="spellStart"/>
-      <w:r>
-        <w:rPr>
-          <w:rFonts w:ascii="Cascadia Mono" w:eastAsia="Times New Roman" w:hAnsi="Cascadia Mono" w:cs="Cascadia Mono"/>
-          <w:color w:val="000000"/>
-          <w:kern w:val="0"/>
-          <w:sz w:val="18"/>
-          <w:szCs w:val="18"/>
-          <w:lang w:val="en-BE" w:eastAsia="en-BE"/>
-          <w14:ligatures w14:val="none"/>
-        </w:rPr>
-        <w:t>gli</w:t>
-      </w:r>
-      <w:proofErr w:type="spellEnd"/>
-      <w:r>
-        <w:rPr>
-          <w:rFonts w:ascii="Cascadia Mono" w:eastAsia="Times New Roman" w:hAnsi="Cascadia Mono" w:cs="Cascadia Mono"/>
-          <w:color w:val="000000"/>
-          <w:kern w:val="0"/>
-          <w:sz w:val="18"/>
-          <w:szCs w:val="18"/>
-          <w:lang w:val="en-BE" w:eastAsia="en-BE"/>
-          <w14:ligatures w14:val="none"/>
-        </w:rPr>
-        <w:t xml:space="preserve"> </w:t>
-      </w:r>
-      <w:proofErr w:type="spellStart"/>
-      <w:r>
-        <w:rPr>
-          <w:rFonts w:ascii="Cascadia Mono" w:eastAsia="Times New Roman" w:hAnsi="Cascadia Mono" w:cs="Cascadia Mono"/>
-          <w:color w:val="000000"/>
-          <w:kern w:val="0"/>
-          <w:sz w:val="18"/>
-          <w:szCs w:val="18"/>
-          <w:lang w:val="en-BE" w:eastAsia="en-BE"/>
-          <w14:ligatures w14:val="none"/>
-        </w:rPr>
-        <w:t>archi</w:t>
-      </w:r>
-      <w:proofErr w:type="spellEnd"/>
-      <w:r>
-        <w:rPr>
-          <w:rFonts w:ascii="Cascadia Mono" w:eastAsia="Times New Roman" w:hAnsi="Cascadia Mono" w:cs="Cascadia Mono"/>
-          <w:color w:val="000000"/>
-          <w:kern w:val="0"/>
-          <w:sz w:val="18"/>
-          <w:szCs w:val="18"/>
-          <w:lang w:val="en-BE" w:eastAsia="en-BE"/>
-          <w14:ligatures w14:val="none"/>
-        </w:rPr>
-        <w:t xml:space="preserve"> (ones &lt; k), continua a </w:t>
-      </w:r>
-      <w:proofErr w:type="spellStart"/>
-      <w:r>
-        <w:rPr>
-          <w:rFonts w:ascii="Cascadia Mono" w:eastAsia="Times New Roman" w:hAnsi="Cascadia Mono" w:cs="Cascadia Mono"/>
-          <w:color w:val="000000"/>
-          <w:kern w:val="0"/>
-          <w:sz w:val="18"/>
-          <w:szCs w:val="18"/>
-          <w:lang w:val="en-BE" w:eastAsia="en-BE"/>
-          <w14:ligatures w14:val="none"/>
-        </w:rPr>
-        <w:t>determinare</w:t>
-      </w:r>
-      <w:proofErr w:type="spellEnd"/>
-      <w:r>
-        <w:rPr>
-          <w:rFonts w:ascii="Cascadia Mono" w:eastAsia="Times New Roman" w:hAnsi="Cascadia Mono" w:cs="Cascadia Mono"/>
-          <w:color w:val="000000"/>
-          <w:kern w:val="0"/>
-          <w:sz w:val="18"/>
-          <w:szCs w:val="18"/>
-          <w:lang w:val="en-BE" w:eastAsia="en-BE"/>
-          <w14:ligatures w14:val="none"/>
-        </w:rPr>
-        <w:t xml:space="preserve"> con </w:t>
-      </w:r>
-      <w:proofErr w:type="spellStart"/>
-      <w:r>
-        <w:rPr>
-          <w:rFonts w:ascii="Cascadia Mono" w:eastAsia="Times New Roman" w:hAnsi="Cascadia Mono" w:cs="Cascadia Mono"/>
-          <w:color w:val="000000"/>
-          <w:kern w:val="0"/>
-          <w:sz w:val="18"/>
-          <w:szCs w:val="18"/>
-          <w:lang w:val="en-BE" w:eastAsia="en-BE"/>
-          <w14:ligatures w14:val="none"/>
-        </w:rPr>
-        <w:t>una</w:t>
-      </w:r>
-      <w:proofErr w:type="spellEnd"/>
-      <w:r>
-        <w:rPr>
-          <w:rFonts w:ascii="Cascadia Mono" w:eastAsia="Times New Roman" w:hAnsi="Cascadia Mono" w:cs="Cascadia Mono"/>
-          <w:color w:val="000000"/>
-          <w:kern w:val="0"/>
-          <w:sz w:val="18"/>
-          <w:szCs w:val="18"/>
-          <w:lang w:val="en-BE" w:eastAsia="en-BE"/>
-          <w14:ligatures w14:val="none"/>
-        </w:rPr>
-        <w:t xml:space="preserve"> </w:t>
-      </w:r>
-      <w:proofErr w:type="spellStart"/>
-      <w:r>
-        <w:rPr>
-          <w:rFonts w:ascii="Cascadia Mono" w:eastAsia="Times New Roman" w:hAnsi="Cascadia Mono" w:cs="Cascadia Mono"/>
-          <w:color w:val="000000"/>
-          <w:kern w:val="0"/>
-          <w:sz w:val="18"/>
-          <w:szCs w:val="18"/>
-          <w:lang w:val="en-BE" w:eastAsia="en-BE"/>
-          <w14:ligatures w14:val="none"/>
-        </w:rPr>
-        <w:t>probabilita</w:t>
-      </w:r>
-      <w:proofErr w:type="spellEnd"/>
-      <w:r>
-        <w:rPr>
-          <w:rFonts w:ascii="Cascadia Mono" w:eastAsia="Times New Roman" w:hAnsi="Cascadia Mono" w:cs="Cascadia Mono"/>
-          <w:color w:val="000000"/>
-          <w:kern w:val="0"/>
-          <w:sz w:val="18"/>
-          <w:szCs w:val="18"/>
-          <w:lang w:val="en-BE" w:eastAsia="en-BE"/>
-          <w14:ligatures w14:val="none"/>
-        </w:rPr>
-        <w:t xml:space="preserve">’ se </w:t>
-      </w:r>
-      <w:proofErr w:type="spellStart"/>
-      <w:r>
-        <w:rPr>
-          <w:rFonts w:ascii="Cascadia Mono" w:eastAsia="Times New Roman" w:hAnsi="Cascadia Mono" w:cs="Cascadia Mono"/>
-          <w:color w:val="000000"/>
-          <w:kern w:val="0"/>
-          <w:sz w:val="18"/>
-          <w:szCs w:val="18"/>
-          <w:lang w:val="en-BE" w:eastAsia="en-BE"/>
-          <w14:ligatures w14:val="none"/>
-        </w:rPr>
-        <w:t>instaurare</w:t>
-      </w:r>
-      <w:proofErr w:type="spellEnd"/>
-      <w:r>
-        <w:rPr>
-          <w:rFonts w:ascii="Cascadia Mono" w:eastAsia="Times New Roman" w:hAnsi="Cascadia Mono" w:cs="Cascadia Mono"/>
-          <w:color w:val="000000"/>
-          <w:kern w:val="0"/>
-          <w:sz w:val="18"/>
-          <w:szCs w:val="18"/>
-          <w:lang w:val="en-BE" w:eastAsia="en-BE"/>
-          <w14:ligatures w14:val="none"/>
-        </w:rPr>
-        <w:t xml:space="preserve"> il </w:t>
-      </w:r>
-      <w:proofErr w:type="spellStart"/>
-      <w:r>
-        <w:rPr>
-          <w:rFonts w:ascii="Cascadia Mono" w:eastAsia="Times New Roman" w:hAnsi="Cascadia Mono" w:cs="Cascadia Mono"/>
-          <w:color w:val="000000"/>
-          <w:kern w:val="0"/>
-          <w:sz w:val="18"/>
-          <w:szCs w:val="18"/>
-          <w:lang w:val="en-BE" w:eastAsia="en-BE"/>
-          <w14:ligatures w14:val="none"/>
-        </w:rPr>
-        <w:t>collegamento</w:t>
-      </w:r>
-      <w:proofErr w:type="spellEnd"/>
-      <w:r>
-        <w:rPr>
-          <w:rFonts w:ascii="Cascadia Mono" w:eastAsia="Times New Roman" w:hAnsi="Cascadia Mono" w:cs="Cascadia Mono"/>
-          <w:color w:val="000000"/>
-          <w:kern w:val="0"/>
-          <w:sz w:val="18"/>
-          <w:szCs w:val="18"/>
-          <w:lang w:val="en-BE" w:eastAsia="en-BE"/>
-          <w14:ligatures w14:val="none"/>
-        </w:rPr>
-        <w:t xml:space="preserve"> o no.</w:t>
+      <w:r>
+        <w:rPr>
+          <w:rFonts w:ascii="Cascadia Mono" w:eastAsia="Times New Roman" w:hAnsi="Cascadia Mono" w:cs="Cascadia Mono"/>
+          <w:color w:val="000000"/>
+          <w:kern w:val="0"/>
+          <w:sz w:val="18"/>
+          <w:szCs w:val="18"/>
+          <w:lang w:val="en-BE" w:eastAsia="en-BE"/>
+          <w14:ligatures w14:val="none"/>
+        </w:rPr>
+        <w:t>Comunque a prescindere dalla ottimizzazione e’ un procesimento molto semplice, per ciascun nodo finche’ non ha esplorato tutti gli altri nodi o saturato gli archi (ones &lt; k), continua a determinare con una probabilita’ se instaurare il collegamento o no.</w:t>
       </w:r>
     </w:p>
     <w:p>
@@ -3310,7 +1531,7 @@
           <w:rFonts w:ascii="Aptos" w:eastAsia="Aptos" w:hAnsi="Aptos" w:cs="Times New Roman"/>
         </w:rPr>
       </w:pPr>
-      <w:hyperlink r:id="rId5" w:history="1">
+      <w:hyperlink r:id="rId6" w:history="1">
         <w:r>
           <w:rPr>
             <w:rFonts w:ascii="Aptos" w:eastAsia="Aptos" w:hAnsi="Aptos" w:cs="Times New Roman"/>
@@ -3402,36 +1623,8 @@
           <w:lang w:val="en-BE" w:eastAsia="en-BE"/>
           <w14:ligatures w14:val="none"/>
         </w:rPr>
-        <w:t xml:space="preserve"> </w:t>
-      </w:r>
-      <w:proofErr w:type="spellStart"/>
-      <w:proofErr w:type="gramStart"/>
-      <w:r>
-        <w:rPr>
-          <w:rFonts w:ascii="Cascadia Mono" w:eastAsia="Times New Roman" w:hAnsi="Cascadia Mono" w:cs="Cascadia Mono"/>
-          <w:color w:val="000000"/>
-          <w:kern w:val="0"/>
-          <w:sz w:val="18"/>
-          <w:szCs w:val="18"/>
-          <w:lang w:val="en-BE" w:eastAsia="en-BE"/>
-          <w14:ligatures w14:val="none"/>
-        </w:rPr>
-        <w:t>entrantiV</w:t>
-      </w:r>
-      <w:proofErr w:type="spellEnd"/>
-      <w:r>
-        <w:rPr>
-          <w:rFonts w:ascii="Cascadia Mono" w:eastAsia="Times New Roman" w:hAnsi="Cascadia Mono" w:cs="Cascadia Mono"/>
-          <w:color w:val="000000"/>
-          <w:kern w:val="0"/>
-          <w:sz w:val="18"/>
-          <w:szCs w:val="18"/>
-          <w:lang w:val="en-BE" w:eastAsia="en-BE"/>
-          <w14:ligatures w14:val="none"/>
-        </w:rPr>
-        <w:t>(</w:t>
-      </w:r>
-      <w:proofErr w:type="gramEnd"/>
+        <w:t xml:space="preserve"> entrantiV(</w:t>
+      </w:r>
       <w:r>
         <w:rPr>
           <w:rFonts w:ascii="Cascadia Mono" w:eastAsia="Times New Roman" w:hAnsi="Cascadia Mono" w:cs="Cascadia Mono"/>
@@ -3570,111 +1763,7 @@
           <w:lang w:val="en-BE" w:eastAsia="en-BE"/>
           <w14:ligatures w14:val="none"/>
         </w:rPr>
-        <w:t xml:space="preserve"> </w:t>
-      </w:r>
-      <w:proofErr w:type="spellStart"/>
-      <w:r>
-        <w:rPr>
-          <w:rFonts w:ascii="Cascadia Mono" w:eastAsia="Times New Roman" w:hAnsi="Cascadia Mono" w:cs="Cascadia Mono"/>
-          <w:color w:val="000000"/>
-          <w:kern w:val="0"/>
-          <w:sz w:val="18"/>
-          <w:szCs w:val="18"/>
-          <w:lang w:val="en-BE" w:eastAsia="en-BE"/>
-          <w14:ligatures w14:val="none"/>
-        </w:rPr>
-        <w:t>i</w:t>
-      </w:r>
-      <w:proofErr w:type="spellEnd"/>
-      <w:r>
-        <w:rPr>
-          <w:rFonts w:ascii="Cascadia Mono" w:eastAsia="Times New Roman" w:hAnsi="Cascadia Mono" w:cs="Cascadia Mono"/>
-          <w:color w:val="000000"/>
-          <w:kern w:val="0"/>
-          <w:sz w:val="18"/>
-          <w:szCs w:val="18"/>
-          <w:lang w:val="en-BE" w:eastAsia="en-BE"/>
-          <w14:ligatures w14:val="none"/>
-        </w:rPr>
-        <w:t xml:space="preserve"> = 0; </w:t>
-      </w:r>
-      <w:proofErr w:type="spellStart"/>
-      <w:r>
-        <w:rPr>
-          <w:rFonts w:ascii="Cascadia Mono" w:eastAsia="Times New Roman" w:hAnsi="Cascadia Mono" w:cs="Cascadia Mono"/>
-          <w:color w:val="000000"/>
-          <w:kern w:val="0"/>
-          <w:sz w:val="18"/>
-          <w:szCs w:val="18"/>
-          <w:lang w:val="en-BE" w:eastAsia="en-BE"/>
-          <w14:ligatures w14:val="none"/>
-        </w:rPr>
-        <w:t>i</w:t>
-      </w:r>
-      <w:proofErr w:type="spellEnd"/>
-      <w:r>
-        <w:rPr>
-          <w:rFonts w:ascii="Cascadia Mono" w:eastAsia="Times New Roman" w:hAnsi="Cascadia Mono" w:cs="Cascadia Mono"/>
-          <w:color w:val="000000"/>
-          <w:kern w:val="0"/>
-          <w:sz w:val="18"/>
-          <w:szCs w:val="18"/>
-          <w:lang w:val="en-BE" w:eastAsia="en-BE"/>
-          <w14:ligatures w14:val="none"/>
-        </w:rPr>
-        <w:t xml:space="preserve"> &lt; </w:t>
-      </w:r>
-      <w:proofErr w:type="spellStart"/>
-      <w:r>
-        <w:rPr>
-          <w:rFonts w:ascii="Cascadia Mono" w:eastAsia="Times New Roman" w:hAnsi="Cascadia Mono" w:cs="Cascadia Mono"/>
-          <w:color w:val="000000"/>
-          <w:kern w:val="0"/>
-          <w:sz w:val="18"/>
-          <w:szCs w:val="18"/>
-          <w:lang w:val="en-BE" w:eastAsia="en-BE"/>
-          <w14:ligatures w14:val="none"/>
-        </w:rPr>
-        <w:t>numVertex</w:t>
-      </w:r>
-      <w:proofErr w:type="spellEnd"/>
-      <w:r>
-        <w:rPr>
-          <w:rFonts w:ascii="Cascadia Mono" w:eastAsia="Times New Roman" w:hAnsi="Cascadia Mono" w:cs="Cascadia Mono"/>
-          <w:color w:val="000000"/>
-          <w:kern w:val="0"/>
-          <w:sz w:val="18"/>
-          <w:szCs w:val="18"/>
-          <w:lang w:val="en-BE" w:eastAsia="en-BE"/>
-          <w14:ligatures w14:val="none"/>
-        </w:rPr>
-        <w:t xml:space="preserve">; </w:t>
-      </w:r>
-      <w:proofErr w:type="spellStart"/>
-      <w:r>
-        <w:rPr>
-          <w:rFonts w:ascii="Cascadia Mono" w:eastAsia="Times New Roman" w:hAnsi="Cascadia Mono" w:cs="Cascadia Mono"/>
-          <w:color w:val="000000"/>
-          <w:kern w:val="0"/>
-          <w:sz w:val="18"/>
-          <w:szCs w:val="18"/>
-          <w:lang w:val="en-BE" w:eastAsia="en-BE"/>
-          <w14:ligatures w14:val="none"/>
-        </w:rPr>
-        <w:t>i</w:t>
-      </w:r>
-      <w:proofErr w:type="spellEnd"/>
-      <w:r>
-        <w:rPr>
-          <w:rFonts w:ascii="Cascadia Mono" w:eastAsia="Times New Roman" w:hAnsi="Cascadia Mono" w:cs="Cascadia Mono"/>
-          <w:color w:val="000000"/>
-          <w:kern w:val="0"/>
-          <w:sz w:val="18"/>
-          <w:szCs w:val="18"/>
-          <w:lang w:val="en-BE" w:eastAsia="en-BE"/>
-          <w14:ligatures w14:val="none"/>
-        </w:rPr>
-        <w:t>++) {</w:t>
+        <w:t xml:space="preserve"> i = 0; i &lt; numVertex; i++) {</w:t>
       </w:r>
     </w:p>
     <w:p>
@@ -3754,47 +1843,7 @@
           <w:lang w:val="en-BE" w:eastAsia="en-BE"/>
           <w14:ligatures w14:val="none"/>
         </w:rPr>
-        <w:t xml:space="preserve"> (</w:t>
-      </w:r>
-      <w:proofErr w:type="spellStart"/>
-      <w:proofErr w:type="gramStart"/>
-      <w:r>
-        <w:rPr>
-          <w:rFonts w:ascii="Cascadia Mono" w:eastAsia="Times New Roman" w:hAnsi="Cascadia Mono" w:cs="Cascadia Mono"/>
-          <w:color w:val="000000"/>
-          <w:kern w:val="0"/>
-          <w:sz w:val="18"/>
-          <w:szCs w:val="18"/>
-          <w:lang w:val="en-BE" w:eastAsia="en-BE"/>
-          <w14:ligatures w14:val="none"/>
-        </w:rPr>
-        <w:t>i</w:t>
-      </w:r>
-      <w:proofErr w:type="spellEnd"/>
-      <w:r>
-        <w:rPr>
-          <w:rFonts w:ascii="Cascadia Mono" w:eastAsia="Times New Roman" w:hAnsi="Cascadia Mono" w:cs="Cascadia Mono"/>
-          <w:color w:val="000000"/>
-          <w:kern w:val="0"/>
-          <w:sz w:val="18"/>
-          <w:szCs w:val="18"/>
-          <w:lang w:val="en-BE" w:eastAsia="en-BE"/>
-          <w14:ligatures w14:val="none"/>
-        </w:rPr>
-        <w:t xml:space="preserve"> !</w:t>
-      </w:r>
-      <w:proofErr w:type="gramEnd"/>
-      <w:r>
-        <w:rPr>
-          <w:rFonts w:ascii="Cascadia Mono" w:eastAsia="Times New Roman" w:hAnsi="Cascadia Mono" w:cs="Cascadia Mono"/>
-          <w:color w:val="000000"/>
-          <w:kern w:val="0"/>
-          <w:sz w:val="18"/>
-          <w:szCs w:val="18"/>
-          <w:lang w:val="en-BE" w:eastAsia="en-BE"/>
-          <w14:ligatures w14:val="none"/>
-        </w:rPr>
-        <w:t xml:space="preserve">= </w:t>
+        <w:t xml:space="preserve"> (i != </w:t>
       </w:r>
       <w:r>
         <w:rPr>
@@ -3979,61 +2028,7 @@
           <w:lang w:val="en-BE" w:eastAsia="en-BE"/>
           <w14:ligatures w14:val="none"/>
         </w:rPr>
-        <w:t xml:space="preserve"> (</w:t>
-      </w:r>
-      <w:proofErr w:type="spellStart"/>
-      <w:proofErr w:type="gramStart"/>
-      <w:r>
-        <w:rPr>
-          <w:rFonts w:ascii="Cascadia Mono" w:eastAsia="Times New Roman" w:hAnsi="Cascadia Mono" w:cs="Cascadia Mono"/>
-          <w:color w:val="000000"/>
-          <w:kern w:val="0"/>
-          <w:sz w:val="18"/>
-          <w:szCs w:val="18"/>
-          <w:lang w:val="en-BE" w:eastAsia="en-BE"/>
-          <w14:ligatures w14:val="none"/>
-        </w:rPr>
-        <w:t>isEdge</w:t>
-      </w:r>
-      <w:proofErr w:type="spellEnd"/>
-      <w:r>
-        <w:rPr>
-          <w:rFonts w:ascii="Cascadia Mono" w:eastAsia="Times New Roman" w:hAnsi="Cascadia Mono" w:cs="Cascadia Mono"/>
-          <w:color w:val="000000"/>
-          <w:kern w:val="0"/>
-          <w:sz w:val="18"/>
-          <w:szCs w:val="18"/>
-          <w:lang w:val="en-BE" w:eastAsia="en-BE"/>
-          <w14:ligatures w14:val="none"/>
-        </w:rPr>
-        <w:t>(</w:t>
-      </w:r>
-      <w:proofErr w:type="spellStart"/>
-      <w:proofErr w:type="gramEnd"/>
-      <w:r>
-        <w:rPr>
-          <w:rFonts w:ascii="Cascadia Mono" w:eastAsia="Times New Roman" w:hAnsi="Cascadia Mono" w:cs="Cascadia Mono"/>
-          <w:color w:val="000000"/>
-          <w:kern w:val="0"/>
-          <w:sz w:val="18"/>
-          <w:szCs w:val="18"/>
-          <w:lang w:val="en-BE" w:eastAsia="en-BE"/>
-          <w14:ligatures w14:val="none"/>
-        </w:rPr>
-        <w:t>i</w:t>
-      </w:r>
-      <w:proofErr w:type="spellEnd"/>
-      <w:r>
-        <w:rPr>
-          <w:rFonts w:ascii="Cascadia Mono" w:eastAsia="Times New Roman" w:hAnsi="Cascadia Mono" w:cs="Cascadia Mono"/>
-          <w:color w:val="000000"/>
-          <w:kern w:val="0"/>
-          <w:sz w:val="18"/>
-          <w:szCs w:val="18"/>
-          <w:lang w:val="en-BE" w:eastAsia="en-BE"/>
-          <w14:ligatures w14:val="none"/>
-        </w:rPr>
-        <w:t xml:space="preserve">, </w:t>
+        <w:t xml:space="preserve"> (isEdge(i, </w:t>
       </w:r>
       <w:r>
         <w:rPr>
@@ -4138,60 +2133,7 @@
           <w14:ligatures w14:val="none"/>
         </w:rPr>
         <w:tab/>
-      </w:r>
-      <w:proofErr w:type="spellStart"/>
-      <w:proofErr w:type="gramStart"/>
-      <w:r>
-        <w:rPr>
-          <w:rFonts w:ascii="Cascadia Mono" w:eastAsia="Times New Roman" w:hAnsi="Cascadia Mono" w:cs="Cascadia Mono"/>
-          <w:color w:val="000000"/>
-          <w:kern w:val="0"/>
-          <w:sz w:val="18"/>
-          <w:szCs w:val="18"/>
-          <w:lang w:val="en-BE" w:eastAsia="en-BE"/>
-          <w14:ligatures w14:val="none"/>
-        </w:rPr>
-        <w:t>delEdge</w:t>
-      </w:r>
-      <w:proofErr w:type="spellEnd"/>
-      <w:r>
-        <w:rPr>
-          <w:rFonts w:ascii="Cascadia Mono" w:eastAsia="Times New Roman" w:hAnsi="Cascadia Mono" w:cs="Cascadia Mono"/>
-          <w:color w:val="000000"/>
-          <w:kern w:val="0"/>
-          <w:sz w:val="18"/>
-          <w:szCs w:val="18"/>
-          <w:lang w:val="en-BE" w:eastAsia="en-BE"/>
-          <w14:ligatures w14:val="none"/>
-        </w:rPr>
-        <w:t>(</w:t>
-      </w:r>
-      <w:proofErr w:type="spellStart"/>
-      <w:proofErr w:type="gramEnd"/>
-      <w:r>
-        <w:rPr>
-          <w:rFonts w:ascii="Cascadia Mono" w:eastAsia="Times New Roman" w:hAnsi="Cascadia Mono" w:cs="Cascadia Mono"/>
-          <w:color w:val="000000"/>
-          <w:kern w:val="0"/>
-          <w:sz w:val="18"/>
-          <w:szCs w:val="18"/>
-          <w:lang w:val="en-BE" w:eastAsia="en-BE"/>
-          <w14:ligatures w14:val="none"/>
-        </w:rPr>
-        <w:t>i</w:t>
-      </w:r>
-      <w:proofErr w:type="spellEnd"/>
-      <w:r>
-        <w:rPr>
-          <w:rFonts w:ascii="Cascadia Mono" w:eastAsia="Times New Roman" w:hAnsi="Cascadia Mono" w:cs="Cascadia Mono"/>
-          <w:color w:val="000000"/>
-          <w:kern w:val="0"/>
-          <w:sz w:val="18"/>
-          <w:szCs w:val="18"/>
-          <w:lang w:val="en-BE" w:eastAsia="en-BE"/>
-          <w14:ligatures w14:val="none"/>
-        </w:rPr>
-        <w:t xml:space="preserve">, </w:t>
+        <w:t xml:space="preserve">delEdge(i, </w:t>
       </w:r>
       <w:r>
         <w:rPr>
@@ -4477,111 +2419,7 @@
           <w:lang w:val="en-BE" w:eastAsia="en-BE"/>
           <w14:ligatures w14:val="none"/>
         </w:rPr>
-        <w:t xml:space="preserve"> </w:t>
-      </w:r>
-      <w:proofErr w:type="spellStart"/>
-      <w:r>
-        <w:rPr>
-          <w:rFonts w:ascii="Cascadia Mono" w:eastAsia="Times New Roman" w:hAnsi="Cascadia Mono" w:cs="Cascadia Mono"/>
-          <w:color w:val="000000"/>
-          <w:kern w:val="0"/>
-          <w:sz w:val="18"/>
-          <w:szCs w:val="18"/>
-          <w:lang w:val="en-BE" w:eastAsia="en-BE"/>
-          <w14:ligatures w14:val="none"/>
-        </w:rPr>
-        <w:t>i</w:t>
-      </w:r>
-      <w:proofErr w:type="spellEnd"/>
-      <w:r>
-        <w:rPr>
-          <w:rFonts w:ascii="Cascadia Mono" w:eastAsia="Times New Roman" w:hAnsi="Cascadia Mono" w:cs="Cascadia Mono"/>
-          <w:color w:val="000000"/>
-          <w:kern w:val="0"/>
-          <w:sz w:val="18"/>
-          <w:szCs w:val="18"/>
-          <w:lang w:val="en-BE" w:eastAsia="en-BE"/>
-          <w14:ligatures w14:val="none"/>
-        </w:rPr>
-        <w:t xml:space="preserve"> = 0; </w:t>
-      </w:r>
-      <w:proofErr w:type="spellStart"/>
-      <w:r>
-        <w:rPr>
-          <w:rFonts w:ascii="Cascadia Mono" w:eastAsia="Times New Roman" w:hAnsi="Cascadia Mono" w:cs="Cascadia Mono"/>
-          <w:color w:val="000000"/>
-          <w:kern w:val="0"/>
-          <w:sz w:val="18"/>
-          <w:szCs w:val="18"/>
-          <w:lang w:val="en-BE" w:eastAsia="en-BE"/>
-          <w14:ligatures w14:val="none"/>
-        </w:rPr>
-        <w:t>i</w:t>
-      </w:r>
-      <w:proofErr w:type="spellEnd"/>
-      <w:r>
-        <w:rPr>
-          <w:rFonts w:ascii="Cascadia Mono" w:eastAsia="Times New Roman" w:hAnsi="Cascadia Mono" w:cs="Cascadia Mono"/>
-          <w:color w:val="000000"/>
-          <w:kern w:val="0"/>
-          <w:sz w:val="18"/>
-          <w:szCs w:val="18"/>
-          <w:lang w:val="en-BE" w:eastAsia="en-BE"/>
-          <w14:ligatures w14:val="none"/>
-        </w:rPr>
-        <w:t xml:space="preserve"> &lt; G-&gt;</w:t>
-      </w:r>
-      <w:proofErr w:type="gramStart"/>
-      <w:r>
-        <w:rPr>
-          <w:rFonts w:ascii="Cascadia Mono" w:eastAsia="Times New Roman" w:hAnsi="Cascadia Mono" w:cs="Cascadia Mono"/>
-          <w:color w:val="000000"/>
-          <w:kern w:val="0"/>
-          <w:sz w:val="18"/>
-          <w:szCs w:val="18"/>
-          <w:lang w:val="en-BE" w:eastAsia="en-BE"/>
-          <w14:ligatures w14:val="none"/>
-        </w:rPr>
-        <w:t>n(</w:t>
-      </w:r>
-      <w:proofErr w:type="gramEnd"/>
-      <w:r>
-        <w:rPr>
-          <w:rFonts w:ascii="Cascadia Mono" w:eastAsia="Times New Roman" w:hAnsi="Cascadia Mono" w:cs="Cascadia Mono"/>
-          <w:color w:val="000000"/>
-          <w:kern w:val="0"/>
-          <w:sz w:val="18"/>
-          <w:szCs w:val="18"/>
-          <w:lang w:val="en-BE" w:eastAsia="en-BE"/>
-          <w14:ligatures w14:val="none"/>
-        </w:rPr>
-        <w:t xml:space="preserve">); </w:t>
-      </w:r>
-      <w:proofErr w:type="spellStart"/>
-      <w:r>
-        <w:rPr>
-          <w:rFonts w:ascii="Cascadia Mono" w:eastAsia="Times New Roman" w:hAnsi="Cascadia Mono" w:cs="Cascadia Mono"/>
-          <w:color w:val="000000"/>
-          <w:kern w:val="0"/>
-          <w:sz w:val="18"/>
-          <w:szCs w:val="18"/>
-          <w:lang w:val="en-BE" w:eastAsia="en-BE"/>
-          <w14:ligatures w14:val="none"/>
-        </w:rPr>
-        <w:t>i</w:t>
-      </w:r>
-      <w:proofErr w:type="spellEnd"/>
-      <w:r>
-        <w:rPr>
-          <w:rFonts w:ascii="Cascadia Mono" w:eastAsia="Times New Roman" w:hAnsi="Cascadia Mono" w:cs="Cascadia Mono"/>
-          <w:color w:val="000000"/>
-          <w:kern w:val="0"/>
-          <w:sz w:val="18"/>
-          <w:szCs w:val="18"/>
-          <w:lang w:val="en-BE" w:eastAsia="en-BE"/>
-          <w14:ligatures w14:val="none"/>
-        </w:rPr>
-        <w:t>++) {</w:t>
+        <w:t xml:space="preserve"> i = 0; i &lt; G-&gt;n(); i++) {</w:t>
       </w:r>
     </w:p>
     <w:p>
@@ -4673,99 +2511,7 @@
           <w:lang w:val="en-BE" w:eastAsia="en-BE"/>
           <w14:ligatures w14:val="none"/>
         </w:rPr>
-        <w:t xml:space="preserve"> w = G-&gt;first(</w:t>
-      </w:r>
-      <w:proofErr w:type="spellStart"/>
-      <w:r>
-        <w:rPr>
-          <w:rFonts w:ascii="Cascadia Mono" w:eastAsia="Times New Roman" w:hAnsi="Cascadia Mono" w:cs="Cascadia Mono"/>
-          <w:color w:val="000000"/>
-          <w:kern w:val="0"/>
-          <w:sz w:val="18"/>
-          <w:szCs w:val="18"/>
-          <w:lang w:val="en-BE" w:eastAsia="en-BE"/>
-          <w14:ligatures w14:val="none"/>
-        </w:rPr>
-        <w:t>i</w:t>
-      </w:r>
-      <w:proofErr w:type="spellEnd"/>
-      <w:r>
-        <w:rPr>
-          <w:rFonts w:ascii="Cascadia Mono" w:eastAsia="Times New Roman" w:hAnsi="Cascadia Mono" w:cs="Cascadia Mono"/>
-          <w:color w:val="000000"/>
-          <w:kern w:val="0"/>
-          <w:sz w:val="18"/>
-          <w:szCs w:val="18"/>
-          <w:lang w:val="en-BE" w:eastAsia="en-BE"/>
-          <w14:ligatures w14:val="none"/>
-        </w:rPr>
-        <w:t>); w &lt; G-&gt;</w:t>
-      </w:r>
-      <w:proofErr w:type="gramStart"/>
-      <w:r>
-        <w:rPr>
-          <w:rFonts w:ascii="Cascadia Mono" w:eastAsia="Times New Roman" w:hAnsi="Cascadia Mono" w:cs="Cascadia Mono"/>
-          <w:color w:val="000000"/>
-          <w:kern w:val="0"/>
-          <w:sz w:val="18"/>
-          <w:szCs w:val="18"/>
-          <w:lang w:val="en-BE" w:eastAsia="en-BE"/>
-          <w14:ligatures w14:val="none"/>
-        </w:rPr>
-        <w:t>n(</w:t>
-      </w:r>
-      <w:proofErr w:type="gramEnd"/>
-      <w:r>
-        <w:rPr>
-          <w:rFonts w:ascii="Cascadia Mono" w:eastAsia="Times New Roman" w:hAnsi="Cascadia Mono" w:cs="Cascadia Mono"/>
-          <w:color w:val="000000"/>
-          <w:kern w:val="0"/>
-          <w:sz w:val="18"/>
-          <w:szCs w:val="18"/>
-          <w:lang w:val="en-BE" w:eastAsia="en-BE"/>
-          <w14:ligatures w14:val="none"/>
-        </w:rPr>
-        <w:t>); w = G-&gt;</w:t>
-      </w:r>
-      <w:proofErr w:type="gramStart"/>
-      <w:r>
-        <w:rPr>
-          <w:rFonts w:ascii="Cascadia Mono" w:eastAsia="Times New Roman" w:hAnsi="Cascadia Mono" w:cs="Cascadia Mono"/>
-          <w:color w:val="000000"/>
-          <w:kern w:val="0"/>
-          <w:sz w:val="18"/>
-          <w:szCs w:val="18"/>
-          <w:lang w:val="en-BE" w:eastAsia="en-BE"/>
-          <w14:ligatures w14:val="none"/>
-        </w:rPr>
-        <w:t>next(</w:t>
-      </w:r>
-      <w:proofErr w:type="spellStart"/>
-      <w:proofErr w:type="gramEnd"/>
-      <w:r>
-        <w:rPr>
-          <w:rFonts w:ascii="Cascadia Mono" w:eastAsia="Times New Roman" w:hAnsi="Cascadia Mono" w:cs="Cascadia Mono"/>
-          <w:color w:val="000000"/>
-          <w:kern w:val="0"/>
-          <w:sz w:val="18"/>
-          <w:szCs w:val="18"/>
-          <w:lang w:val="en-BE" w:eastAsia="en-BE"/>
-          <w14:ligatures w14:val="none"/>
-        </w:rPr>
-        <w:t>i</w:t>
-      </w:r>
-      <w:proofErr w:type="spellEnd"/>
-      <w:r>
-        <w:rPr>
-          <w:rFonts w:ascii="Cascadia Mono" w:eastAsia="Times New Roman" w:hAnsi="Cascadia Mono" w:cs="Cascadia Mono"/>
-          <w:color w:val="000000"/>
-          <w:kern w:val="0"/>
-          <w:sz w:val="18"/>
-          <w:szCs w:val="18"/>
-          <w:lang w:val="en-BE" w:eastAsia="en-BE"/>
-          <w14:ligatures w14:val="none"/>
-        </w:rPr>
-        <w:t>, w)) {</w:t>
+        <w:t xml:space="preserve"> w = G-&gt;first(i); w &lt; G-&gt;n(); w = G-&gt;next(i, w)) {</w:t>
       </w:r>
     </w:p>
     <w:p>
@@ -4914,61 +2660,7 @@
           <w14:ligatures w14:val="none"/>
         </w:rPr>
         <w:tab/>
-        <w:t>G-&gt;</w:t>
-      </w:r>
-      <w:proofErr w:type="spellStart"/>
-      <w:proofErr w:type="gramStart"/>
-      <w:r>
-        <w:rPr>
-          <w:rFonts w:ascii="Cascadia Mono" w:eastAsia="Times New Roman" w:hAnsi="Cascadia Mono" w:cs="Cascadia Mono"/>
-          <w:color w:val="000000"/>
-          <w:kern w:val="0"/>
-          <w:sz w:val="18"/>
-          <w:szCs w:val="18"/>
-          <w:lang w:val="en-BE" w:eastAsia="en-BE"/>
-          <w14:ligatures w14:val="none"/>
-        </w:rPr>
-        <w:t>delEdge</w:t>
-      </w:r>
-      <w:proofErr w:type="spellEnd"/>
-      <w:r>
-        <w:rPr>
-          <w:rFonts w:ascii="Cascadia Mono" w:eastAsia="Times New Roman" w:hAnsi="Cascadia Mono" w:cs="Cascadia Mono"/>
-          <w:color w:val="000000"/>
-          <w:kern w:val="0"/>
-          <w:sz w:val="18"/>
-          <w:szCs w:val="18"/>
-          <w:lang w:val="en-BE" w:eastAsia="en-BE"/>
-          <w14:ligatures w14:val="none"/>
-        </w:rPr>
-        <w:t>(</w:t>
-      </w:r>
-      <w:proofErr w:type="spellStart"/>
-      <w:proofErr w:type="gramEnd"/>
-      <w:r>
-        <w:rPr>
-          <w:rFonts w:ascii="Cascadia Mono" w:eastAsia="Times New Roman" w:hAnsi="Cascadia Mono" w:cs="Cascadia Mono"/>
-          <w:color w:val="000000"/>
-          <w:kern w:val="0"/>
-          <w:sz w:val="18"/>
-          <w:szCs w:val="18"/>
-          <w:lang w:val="en-BE" w:eastAsia="en-BE"/>
-          <w14:ligatures w14:val="none"/>
-        </w:rPr>
-        <w:t>i</w:t>
-      </w:r>
-      <w:proofErr w:type="spellEnd"/>
-      <w:r>
-        <w:rPr>
-          <w:rFonts w:ascii="Cascadia Mono" w:eastAsia="Times New Roman" w:hAnsi="Cascadia Mono" w:cs="Cascadia Mono"/>
-          <w:color w:val="000000"/>
-          <w:kern w:val="0"/>
-          <w:sz w:val="18"/>
-          <w:szCs w:val="18"/>
-          <w:lang w:val="en-BE" w:eastAsia="en-BE"/>
-          <w14:ligatures w14:val="none"/>
-        </w:rPr>
-        <w:t>, input);</w:t>
+        <w:t>G-&gt;delEdge(i, input);</w:t>
       </w:r>
     </w:p>
     <w:p>
@@ -5279,61 +2971,7 @@
           <w:lang w:val="en-BE" w:eastAsia="en-BE"/>
           <w14:ligatures w14:val="none"/>
         </w:rPr>
-        <w:t>G-&gt;</w:t>
-      </w:r>
-      <w:proofErr w:type="spellStart"/>
-      <w:proofErr w:type="gramStart"/>
-      <w:r>
-        <w:rPr>
-          <w:rFonts w:ascii="Cascadia Mono" w:eastAsia="Times New Roman" w:hAnsi="Cascadia Mono" w:cs="Cascadia Mono"/>
-          <w:color w:val="000000"/>
-          <w:kern w:val="0"/>
-          <w:sz w:val="18"/>
-          <w:szCs w:val="18"/>
-          <w:lang w:val="en-BE" w:eastAsia="en-BE"/>
-          <w14:ligatures w14:val="none"/>
-        </w:rPr>
-        <w:t>delEdge</w:t>
-      </w:r>
-      <w:proofErr w:type="spellEnd"/>
-      <w:r>
-        <w:rPr>
-          <w:rFonts w:ascii="Cascadia Mono" w:eastAsia="Times New Roman" w:hAnsi="Cascadia Mono" w:cs="Cascadia Mono"/>
-          <w:color w:val="000000"/>
-          <w:kern w:val="0"/>
-          <w:sz w:val="18"/>
-          <w:szCs w:val="18"/>
-          <w:lang w:val="en-BE" w:eastAsia="en-BE"/>
-          <w14:ligatures w14:val="none"/>
-        </w:rPr>
-        <w:t>(</w:t>
-      </w:r>
-      <w:proofErr w:type="spellStart"/>
-      <w:proofErr w:type="gramEnd"/>
-      <w:r>
-        <w:rPr>
-          <w:rFonts w:ascii="Cascadia Mono" w:eastAsia="Times New Roman" w:hAnsi="Cascadia Mono" w:cs="Cascadia Mono"/>
-          <w:color w:val="000000"/>
-          <w:kern w:val="0"/>
-          <w:sz w:val="18"/>
-          <w:szCs w:val="18"/>
-          <w:lang w:val="en-BE" w:eastAsia="en-BE"/>
-          <w14:ligatures w14:val="none"/>
-        </w:rPr>
-        <w:t>i</w:t>
-      </w:r>
-      <w:proofErr w:type="spellEnd"/>
-      <w:r>
-        <w:rPr>
-          <w:rFonts w:ascii="Cascadia Mono" w:eastAsia="Times New Roman" w:hAnsi="Cascadia Mono" w:cs="Cascadia Mono"/>
-          <w:color w:val="000000"/>
-          <w:kern w:val="0"/>
-          <w:sz w:val="18"/>
-          <w:szCs w:val="18"/>
-          <w:lang w:val="en-BE" w:eastAsia="en-BE"/>
-          <w14:ligatures w14:val="none"/>
-        </w:rPr>
-        <w:t>, input);</w:t>
+        <w:t>G-&gt;delEdge(i, input);</w:t>
       </w:r>
     </w:p>
     <w:p>
@@ -5360,7 +2998,520 @@
         <w:t>continua cosi’ finche’ non ha fatto tutti i collegamenti di i e successivamente tutti i nodi del grafo.</w:t>
       </w:r>
     </w:p>
+    <w:p>
+      <w:pPr>
+        <w:pBdr>
+          <w:bottom w:val="single" w:sz="6" w:space="1" w:color="auto"/>
+        </w:pBdr>
+      </w:pPr>
+    </w:p>
     <w:p/>
+    <w:p/>
+    <w:p/>
+    <w:p/>
+    <w:p/>
+    <w:p/>
+    <w:p/>
+    <w:p/>
+    <w:p/>
+    <w:p/>
+    <w:p>
+      <w:pPr>
+        <w:pStyle w:val="ListParagraph"/>
+        <w:numPr>
+          <w:ilvl w:val="0"/>
+          <w:numId w:val="3"/>
+        </w:numPr>
+      </w:pPr>
+      <w:r>
+        <w:lastRenderedPageBreak/>
+        <w:t>Scrivere un programma per verificare se, dato un grafo connesso, e date in ingresso le etichette di due nodi a e b, dal primo nodo è possibile arrivare al secondo attraverso un cammino di archi orientati. Procedimento: eseguire un attraversamento DFS partendo dal nodo a. Se durante l’attraversamento si incontra il vertice b allora il percorso esiste.</w:t>
+      </w:r>
+    </w:p>
+    <w:p/>
+    <w:p>
+      <w:r>
+        <w:t>DFS-&gt; ricerca in profondita’ di un camimno:</w:t>
+      </w:r>
+    </w:p>
+    <w:p>
+      <w:r>
+        <w:t>apro a, vado nei uscenti di a, espoloro i loro uscenti e se qualcuno porta su b, allora a,b sono connessi.</w:t>
+      </w:r>
+    </w:p>
+    <w:p>
+      <w:r>
+        <w:drawing>
+          <wp:inline distT="0" distB="0" distL="0" distR="0" wp14:anchorId="5B7DC1F2" wp14:editId="29DD0A17">
+            <wp:extent cx="5731510" cy="3307715"/>
+            <wp:effectExtent l="0" t="0" r="2540" b="6985"/>
+            <wp:docPr id="900493888" name="Picture 1"/>
+            <wp:cNvGraphicFramePr>
+              <a:graphicFrameLocks xmlns:a="http://schemas.openxmlformats.org/drawingml/2006/main" noChangeAspect="1"/>
+            </wp:cNvGraphicFramePr>
+            <a:graphic xmlns:a="http://schemas.openxmlformats.org/drawingml/2006/main">
+              <a:graphicData uri="http://schemas.openxmlformats.org/drawingml/2006/picture">
+                <pic:pic xmlns:pic="http://schemas.openxmlformats.org/drawingml/2006/picture">
+                  <pic:nvPicPr>
+                    <pic:cNvPr id="900493888" name=""/>
+                    <pic:cNvPicPr/>
+                  </pic:nvPicPr>
+                  <pic:blipFill>
+                    <a:blip r:embed="rId7"/>
+                    <a:stretch>
+                      <a:fillRect/>
+                    </a:stretch>
+                  </pic:blipFill>
+                  <pic:spPr>
+                    <a:xfrm>
+                      <a:off x="0" y="0"/>
+                      <a:ext cx="5731510" cy="3307715"/>
+                    </a:xfrm>
+                    <a:prstGeom prst="rect">
+                      <a:avLst/>
+                    </a:prstGeom>
+                  </pic:spPr>
+                </pic:pic>
+              </a:graphicData>
+            </a:graphic>
+          </wp:inline>
+        </w:drawing>
+      </w:r>
+      <w:r>
+        <w:t xml:space="preserve"> </w:t>
+      </w:r>
+    </w:p>
+    <w:p/>
+    <w:p>
+      <w:pPr>
+        <w:pStyle w:val="HTMLPreformatted"/>
+        <w:rPr>
+          <w:rFonts w:ascii="Cascadia Mono" w:eastAsia="Times New Roman" w:hAnsi="Cascadia Mono" w:cs="Cascadia Mono"/>
+          <w:color w:val="000000"/>
+          <w:kern w:val="0"/>
+          <w:sz w:val="18"/>
+          <w:szCs w:val="18"/>
+          <w:lang w:val="en-BE" w:eastAsia="en-BE"/>
+          <w14:ligatures w14:val="none"/>
+        </w:rPr>
+      </w:pPr>
+      <w:r>
+        <w:t>Si chiama esiste cammino che poi richiama internamente DFS:</w:t>
+      </w:r>
+      <w:r>
+        <w:br/>
+      </w:r>
+      <w:r>
+        <w:rPr>
+          <w:rFonts w:ascii="Cascadia Mono" w:eastAsia="Times New Roman" w:hAnsi="Cascadia Mono" w:cs="Cascadia Mono"/>
+          <w:color w:val="000000"/>
+          <w:kern w:val="0"/>
+          <w:sz w:val="18"/>
+          <w:szCs w:val="18"/>
+          <w:lang w:val="en-BE" w:eastAsia="en-BE"/>
+          <w14:ligatures w14:val="none"/>
+        </w:rPr>
+        <w:t xml:space="preserve">cout </w:t>
+      </w:r>
+      <w:r>
+        <w:rPr>
+          <w:rFonts w:ascii="Cascadia Mono" w:eastAsia="Times New Roman" w:hAnsi="Cascadia Mono" w:cs="Cascadia Mono"/>
+          <w:color w:val="008080"/>
+          <w:kern w:val="0"/>
+          <w:sz w:val="18"/>
+          <w:szCs w:val="18"/>
+          <w:lang w:val="en-BE" w:eastAsia="en-BE"/>
+          <w14:ligatures w14:val="none"/>
+        </w:rPr>
+        <w:t>&lt;&lt;</w:t>
+      </w:r>
+      <w:r>
+        <w:rPr>
+          <w:rFonts w:ascii="Cascadia Mono" w:eastAsia="Times New Roman" w:hAnsi="Cascadia Mono" w:cs="Cascadia Mono"/>
+          <w:color w:val="000000"/>
+          <w:kern w:val="0"/>
+          <w:sz w:val="18"/>
+          <w:szCs w:val="18"/>
+          <w:lang w:val="en-BE" w:eastAsia="en-BE"/>
+          <w14:ligatures w14:val="none"/>
+        </w:rPr>
+        <w:t xml:space="preserve"> </w:t>
+      </w:r>
+      <w:r>
+        <w:rPr>
+          <w:rFonts w:ascii="Cascadia Mono" w:eastAsia="Times New Roman" w:hAnsi="Cascadia Mono" w:cs="Cascadia Mono"/>
+          <w:color w:val="A31515"/>
+          <w:kern w:val="0"/>
+          <w:sz w:val="18"/>
+          <w:szCs w:val="18"/>
+          <w:lang w:val="en-BE" w:eastAsia="en-BE"/>
+          <w14:ligatures w14:val="none"/>
+        </w:rPr>
+        <w:t>"Cammino tra ("</w:t>
+      </w:r>
+      <w:r>
+        <w:rPr>
+          <w:rFonts w:ascii="Cascadia Mono" w:eastAsia="Times New Roman" w:hAnsi="Cascadia Mono" w:cs="Cascadia Mono"/>
+          <w:color w:val="000000"/>
+          <w:kern w:val="0"/>
+          <w:sz w:val="18"/>
+          <w:szCs w:val="18"/>
+          <w:lang w:val="en-BE" w:eastAsia="en-BE"/>
+          <w14:ligatures w14:val="none"/>
+        </w:rPr>
+        <w:t xml:space="preserve"> </w:t>
+      </w:r>
+      <w:r>
+        <w:rPr>
+          <w:rFonts w:ascii="Cascadia Mono" w:eastAsia="Times New Roman" w:hAnsi="Cascadia Mono" w:cs="Cascadia Mono"/>
+          <w:color w:val="008080"/>
+          <w:kern w:val="0"/>
+          <w:sz w:val="18"/>
+          <w:szCs w:val="18"/>
+          <w:lang w:val="en-BE" w:eastAsia="en-BE"/>
+          <w14:ligatures w14:val="none"/>
+        </w:rPr>
+        <w:t>&lt;&lt;</w:t>
+      </w:r>
+      <w:r>
+        <w:rPr>
+          <w:rFonts w:ascii="Cascadia Mono" w:eastAsia="Times New Roman" w:hAnsi="Cascadia Mono" w:cs="Cascadia Mono"/>
+          <w:color w:val="000000"/>
+          <w:kern w:val="0"/>
+          <w:sz w:val="18"/>
+          <w:szCs w:val="18"/>
+          <w:lang w:val="en-BE" w:eastAsia="en-BE"/>
+          <w14:ligatures w14:val="none"/>
+        </w:rPr>
+        <w:t xml:space="preserve"> a </w:t>
+      </w:r>
+      <w:r>
+        <w:rPr>
+          <w:rFonts w:ascii="Cascadia Mono" w:eastAsia="Times New Roman" w:hAnsi="Cascadia Mono" w:cs="Cascadia Mono"/>
+          <w:color w:val="008080"/>
+          <w:kern w:val="0"/>
+          <w:sz w:val="18"/>
+          <w:szCs w:val="18"/>
+          <w:lang w:val="en-BE" w:eastAsia="en-BE"/>
+          <w14:ligatures w14:val="none"/>
+        </w:rPr>
+        <w:t>&lt;&lt;</w:t>
+      </w:r>
+      <w:r>
+        <w:rPr>
+          <w:rFonts w:ascii="Cascadia Mono" w:eastAsia="Times New Roman" w:hAnsi="Cascadia Mono" w:cs="Cascadia Mono"/>
+          <w:color w:val="000000"/>
+          <w:kern w:val="0"/>
+          <w:sz w:val="18"/>
+          <w:szCs w:val="18"/>
+          <w:lang w:val="en-BE" w:eastAsia="en-BE"/>
+          <w14:ligatures w14:val="none"/>
+        </w:rPr>
+        <w:t xml:space="preserve"> </w:t>
+      </w:r>
+      <w:r>
+        <w:rPr>
+          <w:rFonts w:ascii="Cascadia Mono" w:eastAsia="Times New Roman" w:hAnsi="Cascadia Mono" w:cs="Cascadia Mono"/>
+          <w:color w:val="A31515"/>
+          <w:kern w:val="0"/>
+          <w:sz w:val="18"/>
+          <w:szCs w:val="18"/>
+          <w:lang w:val="en-BE" w:eastAsia="en-BE"/>
+          <w14:ligatures w14:val="none"/>
+        </w:rPr>
+        <w:t>","</w:t>
+      </w:r>
+      <w:r>
+        <w:rPr>
+          <w:rFonts w:ascii="Cascadia Mono" w:eastAsia="Times New Roman" w:hAnsi="Cascadia Mono" w:cs="Cascadia Mono"/>
+          <w:color w:val="000000"/>
+          <w:kern w:val="0"/>
+          <w:sz w:val="18"/>
+          <w:szCs w:val="18"/>
+          <w:lang w:val="en-BE" w:eastAsia="en-BE"/>
+          <w14:ligatures w14:val="none"/>
+        </w:rPr>
+        <w:t xml:space="preserve"> </w:t>
+      </w:r>
+      <w:r>
+        <w:rPr>
+          <w:rFonts w:ascii="Cascadia Mono" w:eastAsia="Times New Roman" w:hAnsi="Cascadia Mono" w:cs="Cascadia Mono"/>
+          <w:color w:val="008080"/>
+          <w:kern w:val="0"/>
+          <w:sz w:val="18"/>
+          <w:szCs w:val="18"/>
+          <w:lang w:val="en-BE" w:eastAsia="en-BE"/>
+          <w14:ligatures w14:val="none"/>
+        </w:rPr>
+        <w:t>&lt;&lt;</w:t>
+      </w:r>
+      <w:r>
+        <w:rPr>
+          <w:rFonts w:ascii="Cascadia Mono" w:eastAsia="Times New Roman" w:hAnsi="Cascadia Mono" w:cs="Cascadia Mono"/>
+          <w:color w:val="000000"/>
+          <w:kern w:val="0"/>
+          <w:sz w:val="18"/>
+          <w:szCs w:val="18"/>
+          <w:lang w:val="en-BE" w:eastAsia="en-BE"/>
+          <w14:ligatures w14:val="none"/>
+        </w:rPr>
+        <w:t xml:space="preserve"> b </w:t>
+      </w:r>
+      <w:r>
+        <w:rPr>
+          <w:rFonts w:ascii="Cascadia Mono" w:eastAsia="Times New Roman" w:hAnsi="Cascadia Mono" w:cs="Cascadia Mono"/>
+          <w:color w:val="008080"/>
+          <w:kern w:val="0"/>
+          <w:sz w:val="18"/>
+          <w:szCs w:val="18"/>
+          <w:lang w:val="en-BE" w:eastAsia="en-BE"/>
+          <w14:ligatures w14:val="none"/>
+        </w:rPr>
+        <w:t>&lt;&lt;</w:t>
+      </w:r>
+      <w:r>
+        <w:rPr>
+          <w:rFonts w:ascii="Cascadia Mono" w:eastAsia="Times New Roman" w:hAnsi="Cascadia Mono" w:cs="Cascadia Mono"/>
+          <w:color w:val="000000"/>
+          <w:kern w:val="0"/>
+          <w:sz w:val="18"/>
+          <w:szCs w:val="18"/>
+          <w:lang w:val="en-BE" w:eastAsia="en-BE"/>
+          <w14:ligatures w14:val="none"/>
+        </w:rPr>
+        <w:t xml:space="preserve"> </w:t>
+      </w:r>
+      <w:r>
+        <w:rPr>
+          <w:rFonts w:ascii="Cascadia Mono" w:eastAsia="Times New Roman" w:hAnsi="Cascadia Mono" w:cs="Cascadia Mono"/>
+          <w:color w:val="A31515"/>
+          <w:kern w:val="0"/>
+          <w:sz w:val="18"/>
+          <w:szCs w:val="18"/>
+          <w:lang w:val="en-BE" w:eastAsia="en-BE"/>
+          <w14:ligatures w14:val="none"/>
+        </w:rPr>
+        <w:t>") "</w:t>
+      </w:r>
+      <w:r>
+        <w:rPr>
+          <w:rFonts w:ascii="Cascadia Mono" w:eastAsia="Times New Roman" w:hAnsi="Cascadia Mono" w:cs="Cascadia Mono"/>
+          <w:color w:val="000000"/>
+          <w:kern w:val="0"/>
+          <w:sz w:val="18"/>
+          <w:szCs w:val="18"/>
+          <w:lang w:val="en-BE" w:eastAsia="en-BE"/>
+          <w14:ligatures w14:val="none"/>
+        </w:rPr>
+        <w:t xml:space="preserve"> </w:t>
+      </w:r>
+      <w:r>
+        <w:rPr>
+          <w:rFonts w:ascii="Cascadia Mono" w:eastAsia="Times New Roman" w:hAnsi="Cascadia Mono" w:cs="Cascadia Mono"/>
+          <w:color w:val="008080"/>
+          <w:kern w:val="0"/>
+          <w:sz w:val="18"/>
+          <w:szCs w:val="18"/>
+          <w:lang w:val="en-BE" w:eastAsia="en-BE"/>
+          <w14:ligatures w14:val="none"/>
+        </w:rPr>
+        <w:t>&lt;&lt;</w:t>
+      </w:r>
+      <w:r>
+        <w:rPr>
+          <w:rFonts w:ascii="Cascadia Mono" w:eastAsia="Times New Roman" w:hAnsi="Cascadia Mono" w:cs="Cascadia Mono"/>
+          <w:color w:val="000000"/>
+          <w:kern w:val="0"/>
+          <w:sz w:val="18"/>
+          <w:szCs w:val="18"/>
+          <w:lang w:val="en-BE" w:eastAsia="en-BE"/>
+          <w14:ligatures w14:val="none"/>
+        </w:rPr>
+        <w:t xml:space="preserve"> (esiste_cammino(G, a, b) ?</w:t>
+      </w:r>
+      <w:r>
+        <w:rPr>
+          <w:rFonts w:ascii="Cascadia Mono" w:eastAsia="Times New Roman" w:hAnsi="Cascadia Mono" w:cs="Cascadia Mono"/>
+          <w:color w:val="000000"/>
+          <w:kern w:val="0"/>
+          <w:sz w:val="18"/>
+          <w:szCs w:val="18"/>
+          <w:lang w:val="en-BE" w:eastAsia="en-BE"/>
+          <w14:ligatures w14:val="none"/>
+        </w:rPr>
+        <w:t xml:space="preserve">  </w:t>
+      </w:r>
+      <w:r>
+        <w:rPr>
+          <w:rFonts w:ascii="Cascadia Mono" w:eastAsia="Times New Roman" w:hAnsi="Cascadia Mono" w:cs="Cascadia Mono"/>
+          <w:color w:val="A31515"/>
+          <w:kern w:val="0"/>
+          <w:sz w:val="18"/>
+          <w:szCs w:val="18"/>
+          <w:lang w:val="en-BE" w:eastAsia="en-BE"/>
+          <w14:ligatures w14:val="none"/>
+        </w:rPr>
+        <w:t>trovato!"</w:t>
+      </w:r>
+      <w:r>
+        <w:rPr>
+          <w:rFonts w:ascii="Cascadia Mono" w:eastAsia="Times New Roman" w:hAnsi="Cascadia Mono" w:cs="Cascadia Mono"/>
+          <w:color w:val="000000"/>
+          <w:kern w:val="0"/>
+          <w:sz w:val="18"/>
+          <w:szCs w:val="18"/>
+          <w:lang w:val="en-BE" w:eastAsia="en-BE"/>
+          <w14:ligatures w14:val="none"/>
+        </w:rPr>
+        <w:t xml:space="preserve"> : </w:t>
+      </w:r>
+      <w:r>
+        <w:rPr>
+          <w:rFonts w:ascii="Cascadia Mono" w:eastAsia="Times New Roman" w:hAnsi="Cascadia Mono" w:cs="Cascadia Mono"/>
+          <w:color w:val="A31515"/>
+          <w:kern w:val="0"/>
+          <w:sz w:val="18"/>
+          <w:szCs w:val="18"/>
+          <w:lang w:val="en-BE" w:eastAsia="en-BE"/>
+          <w14:ligatures w14:val="none"/>
+        </w:rPr>
+        <w:t>"non trovato"</w:t>
+      </w:r>
+      <w:r>
+        <w:rPr>
+          <w:rFonts w:ascii="Cascadia Mono" w:eastAsia="Times New Roman" w:hAnsi="Cascadia Mono" w:cs="Cascadia Mono"/>
+          <w:color w:val="000000"/>
+          <w:kern w:val="0"/>
+          <w:sz w:val="18"/>
+          <w:szCs w:val="18"/>
+          <w:lang w:val="en-BE" w:eastAsia="en-BE"/>
+          <w14:ligatures w14:val="none"/>
+        </w:rPr>
+        <w:t xml:space="preserve">) </w:t>
+      </w:r>
+      <w:r>
+        <w:rPr>
+          <w:rFonts w:ascii="Cascadia Mono" w:eastAsia="Times New Roman" w:hAnsi="Cascadia Mono" w:cs="Cascadia Mono"/>
+          <w:color w:val="008080"/>
+          <w:kern w:val="0"/>
+          <w:sz w:val="18"/>
+          <w:szCs w:val="18"/>
+          <w:lang w:val="en-BE" w:eastAsia="en-BE"/>
+          <w14:ligatures w14:val="none"/>
+        </w:rPr>
+        <w:t>&lt;&lt;</w:t>
+      </w:r>
+      <w:r>
+        <w:rPr>
+          <w:rFonts w:ascii="Cascadia Mono" w:eastAsia="Times New Roman" w:hAnsi="Cascadia Mono" w:cs="Cascadia Mono"/>
+          <w:color w:val="000000"/>
+          <w:kern w:val="0"/>
+          <w:sz w:val="18"/>
+          <w:szCs w:val="18"/>
+          <w:lang w:val="en-BE" w:eastAsia="en-BE"/>
+          <w14:ligatures w14:val="none"/>
+        </w:rPr>
+        <w:t xml:space="preserve"> endl;</w:t>
+      </w:r>
+    </w:p>
+    <w:p/>
+    <w:p/>
+    <w:p/>
+    <w:p/>
+    <w:p/>
+    <w:p/>
+    <w:p/>
+    <w:p>
+      <w:r>
+        <w:lastRenderedPageBreak/>
+        <w:t>Esercizi 5,6. Creare dei metodi interni alla classe che modifichino il grafo originale:</w:t>
+      </w:r>
+    </w:p>
+    <w:p>
+      <w:r>
+        <w:drawing>
+          <wp:inline distT="0" distB="0" distL="0" distR="0" wp14:anchorId="2434C83F" wp14:editId="1E6631E3">
+            <wp:extent cx="5731510" cy="3500755"/>
+            <wp:effectExtent l="0" t="0" r="2540" b="4445"/>
+            <wp:docPr id="731202153" name="Picture 1"/>
+            <wp:cNvGraphicFramePr>
+              <a:graphicFrameLocks xmlns:a="http://schemas.openxmlformats.org/drawingml/2006/main" noChangeAspect="1"/>
+            </wp:cNvGraphicFramePr>
+            <a:graphic xmlns:a="http://schemas.openxmlformats.org/drawingml/2006/main">
+              <a:graphicData uri="http://schemas.openxmlformats.org/drawingml/2006/picture">
+                <pic:pic xmlns:pic="http://schemas.openxmlformats.org/drawingml/2006/picture">
+                  <pic:nvPicPr>
+                    <pic:cNvPr id="731202153" name=""/>
+                    <pic:cNvPicPr/>
+                  </pic:nvPicPr>
+                  <pic:blipFill>
+                    <a:blip r:embed="rId8"/>
+                    <a:stretch>
+                      <a:fillRect/>
+                    </a:stretch>
+                  </pic:blipFill>
+                  <pic:spPr>
+                    <a:xfrm>
+                      <a:off x="0" y="0"/>
+                      <a:ext cx="5731510" cy="3500755"/>
+                    </a:xfrm>
+                    <a:prstGeom prst="rect">
+                      <a:avLst/>
+                    </a:prstGeom>
+                  </pic:spPr>
+                </pic:pic>
+              </a:graphicData>
+            </a:graphic>
+          </wp:inline>
+        </w:drawing>
+      </w:r>
+    </w:p>
+    <w:p/>
+    <w:p/>
+    <w:p>
+      <w:r>
+        <w:t>6-&gt; complemet(), dove non c’e’ arco crealo e elimina quelli esistenti</w:t>
+      </w:r>
+    </w:p>
+    <w:p>
+      <w:r>
+        <w:drawing>
+          <wp:inline distT="0" distB="0" distL="0" distR="0" wp14:anchorId="4E7414D5" wp14:editId="6687E085">
+            <wp:extent cx="5731510" cy="2885440"/>
+            <wp:effectExtent l="0" t="0" r="2540" b="0"/>
+            <wp:docPr id="1187792208" name="Picture 1"/>
+            <wp:cNvGraphicFramePr>
+              <a:graphicFrameLocks xmlns:a="http://schemas.openxmlformats.org/drawingml/2006/main" noChangeAspect="1"/>
+            </wp:cNvGraphicFramePr>
+            <a:graphic xmlns:a="http://schemas.openxmlformats.org/drawingml/2006/main">
+              <a:graphicData uri="http://schemas.openxmlformats.org/drawingml/2006/picture">
+                <pic:pic xmlns:pic="http://schemas.openxmlformats.org/drawingml/2006/picture">
+                  <pic:nvPicPr>
+                    <pic:cNvPr id="1187792208" name=""/>
+                    <pic:cNvPicPr/>
+                  </pic:nvPicPr>
+                  <pic:blipFill>
+                    <a:blip r:embed="rId9"/>
+                    <a:stretch>
+                      <a:fillRect/>
+                    </a:stretch>
+                  </pic:blipFill>
+                  <pic:spPr>
+                    <a:xfrm>
+                      <a:off x="0" y="0"/>
+                      <a:ext cx="5731510" cy="2885440"/>
+                    </a:xfrm>
+                    <a:prstGeom prst="rect">
+                      <a:avLst/>
+                    </a:prstGeom>
+                  </pic:spPr>
+                </pic:pic>
+              </a:graphicData>
+            </a:graphic>
+          </wp:inline>
+        </w:drawing>
+      </w:r>
+    </w:p>
     <w:sectPr>
       <w:pgSz w:w="11906" w:h="16838"/>
       <w:pgMar w:top="1440" w:right="1440" w:bottom="1440" w:left="1440" w:header="708" w:footer="708" w:gutter="0"/>
@@ -5456,6 +3607,184 @@
       <w:lvlJc w:val="right"/>
       <w:pPr>
         <w:ind w:left="6480" w:hanging="180"/>
+      </w:pPr>
+    </w:lvl>
+  </w:abstractNum>
+  <w:abstractNum w:abstractNumId="1" w15:restartNumberingAfterBreak="0">
+    <w:nsid w:val="4F4711DF"/>
+    <w:multiLevelType w:val="hybridMultilevel"/>
+    <w:tmpl w:val="8B060080"/>
+    <w:lvl w:ilvl="0" w:tplc="0C00000F">
+      <w:start w:val="4"/>
+      <w:numFmt w:val="decimal"/>
+      <w:lvlText w:val="%1."/>
+      <w:lvlJc w:val="left"/>
+      <w:pPr>
+        <w:ind w:left="720" w:hanging="360"/>
+      </w:pPr>
+      <w:rPr>
+        <w:rFonts w:hint="default"/>
+      </w:rPr>
+    </w:lvl>
+    <w:lvl w:ilvl="1" w:tplc="0C000019" w:tentative="1">
+      <w:start w:val="1"/>
+      <w:numFmt w:val="lowerLetter"/>
+      <w:lvlText w:val="%2."/>
+      <w:lvlJc w:val="left"/>
+      <w:pPr>
+        <w:ind w:left="1440" w:hanging="360"/>
+      </w:pPr>
+    </w:lvl>
+    <w:lvl w:ilvl="2" w:tplc="0C00001B" w:tentative="1">
+      <w:start w:val="1"/>
+      <w:numFmt w:val="lowerRoman"/>
+      <w:lvlText w:val="%3."/>
+      <w:lvlJc w:val="right"/>
+      <w:pPr>
+        <w:ind w:left="2160" w:hanging="180"/>
+      </w:pPr>
+    </w:lvl>
+    <w:lvl w:ilvl="3" w:tplc="0C00000F" w:tentative="1">
+      <w:start w:val="1"/>
+      <w:numFmt w:val="decimal"/>
+      <w:lvlText w:val="%4."/>
+      <w:lvlJc w:val="left"/>
+      <w:pPr>
+        <w:ind w:left="2880" w:hanging="360"/>
+      </w:pPr>
+    </w:lvl>
+    <w:lvl w:ilvl="4" w:tplc="0C000019" w:tentative="1">
+      <w:start w:val="1"/>
+      <w:numFmt w:val="lowerLetter"/>
+      <w:lvlText w:val="%5."/>
+      <w:lvlJc w:val="left"/>
+      <w:pPr>
+        <w:ind w:left="3600" w:hanging="360"/>
+      </w:pPr>
+    </w:lvl>
+    <w:lvl w:ilvl="5" w:tplc="0C00001B" w:tentative="1">
+      <w:start w:val="1"/>
+      <w:numFmt w:val="lowerRoman"/>
+      <w:lvlText w:val="%6."/>
+      <w:lvlJc w:val="right"/>
+      <w:pPr>
+        <w:ind w:left="4320" w:hanging="180"/>
+      </w:pPr>
+    </w:lvl>
+    <w:lvl w:ilvl="6" w:tplc="0C00000F" w:tentative="1">
+      <w:start w:val="1"/>
+      <w:numFmt w:val="decimal"/>
+      <w:lvlText w:val="%7."/>
+      <w:lvlJc w:val="left"/>
+      <w:pPr>
+        <w:ind w:left="5040" w:hanging="360"/>
+      </w:pPr>
+    </w:lvl>
+    <w:lvl w:ilvl="7" w:tplc="0C000019" w:tentative="1">
+      <w:start w:val="1"/>
+      <w:numFmt w:val="lowerLetter"/>
+      <w:lvlText w:val="%8."/>
+      <w:lvlJc w:val="left"/>
+      <w:pPr>
+        <w:ind w:left="5760" w:hanging="360"/>
+      </w:pPr>
+    </w:lvl>
+    <w:lvl w:ilvl="8" w:tplc="0C00001B" w:tentative="1">
+      <w:start w:val="1"/>
+      <w:numFmt w:val="lowerRoman"/>
+      <w:lvlText w:val="%9."/>
+      <w:lvlJc w:val="right"/>
+      <w:pPr>
+        <w:ind w:left="6480" w:hanging="180"/>
+      </w:pPr>
+    </w:lvl>
+  </w:abstractNum>
+  <w:abstractNum w:abstractNumId="2" w15:restartNumberingAfterBreak="0">
+    <w:nsid w:val="544A5A30"/>
+    <w:multiLevelType w:val="hybridMultilevel"/>
+    <w:tmpl w:val="F70C507E"/>
+    <w:lvl w:ilvl="0" w:tplc="71564AB8">
+      <w:start w:val="4"/>
+      <w:numFmt w:val="decimal"/>
+      <w:lvlText w:val="%1)"/>
+      <w:lvlJc w:val="left"/>
+      <w:pPr>
+        <w:ind w:left="1080" w:hanging="360"/>
+      </w:pPr>
+      <w:rPr>
+        <w:rFonts w:hint="default"/>
+      </w:rPr>
+    </w:lvl>
+    <w:lvl w:ilvl="1" w:tplc="0C000019" w:tentative="1">
+      <w:start w:val="1"/>
+      <w:numFmt w:val="lowerLetter"/>
+      <w:lvlText w:val="%2."/>
+      <w:lvlJc w:val="left"/>
+      <w:pPr>
+        <w:ind w:left="1800" w:hanging="360"/>
+      </w:pPr>
+    </w:lvl>
+    <w:lvl w:ilvl="2" w:tplc="0C00001B" w:tentative="1">
+      <w:start w:val="1"/>
+      <w:numFmt w:val="lowerRoman"/>
+      <w:lvlText w:val="%3."/>
+      <w:lvlJc w:val="right"/>
+      <w:pPr>
+        <w:ind w:left="2520" w:hanging="180"/>
+      </w:pPr>
+    </w:lvl>
+    <w:lvl w:ilvl="3" w:tplc="0C00000F" w:tentative="1">
+      <w:start w:val="1"/>
+      <w:numFmt w:val="decimal"/>
+      <w:lvlText w:val="%4."/>
+      <w:lvlJc w:val="left"/>
+      <w:pPr>
+        <w:ind w:left="3240" w:hanging="360"/>
+      </w:pPr>
+    </w:lvl>
+    <w:lvl w:ilvl="4" w:tplc="0C000019" w:tentative="1">
+      <w:start w:val="1"/>
+      <w:numFmt w:val="lowerLetter"/>
+      <w:lvlText w:val="%5."/>
+      <w:lvlJc w:val="left"/>
+      <w:pPr>
+        <w:ind w:left="3960" w:hanging="360"/>
+      </w:pPr>
+    </w:lvl>
+    <w:lvl w:ilvl="5" w:tplc="0C00001B" w:tentative="1">
+      <w:start w:val="1"/>
+      <w:numFmt w:val="lowerRoman"/>
+      <w:lvlText w:val="%6."/>
+      <w:lvlJc w:val="right"/>
+      <w:pPr>
+        <w:ind w:left="4680" w:hanging="180"/>
+      </w:pPr>
+    </w:lvl>
+    <w:lvl w:ilvl="6" w:tplc="0C00000F" w:tentative="1">
+      <w:start w:val="1"/>
+      <w:numFmt w:val="decimal"/>
+      <w:lvlText w:val="%7."/>
+      <w:lvlJc w:val="left"/>
+      <w:pPr>
+        <w:ind w:left="5400" w:hanging="360"/>
+      </w:pPr>
+    </w:lvl>
+    <w:lvl w:ilvl="7" w:tplc="0C000019" w:tentative="1">
+      <w:start w:val="1"/>
+      <w:numFmt w:val="lowerLetter"/>
+      <w:lvlText w:val="%8."/>
+      <w:lvlJc w:val="left"/>
+      <w:pPr>
+        <w:ind w:left="6120" w:hanging="360"/>
+      </w:pPr>
+    </w:lvl>
+    <w:lvl w:ilvl="8" w:tplc="0C00001B" w:tentative="1">
+      <w:start w:val="1"/>
+      <w:numFmt w:val="lowerRoman"/>
+      <w:lvlText w:val="%9."/>
+      <w:lvlJc w:val="right"/>
+      <w:pPr>
+        <w:ind w:left="6840" w:hanging="180"/>
       </w:pPr>
     </w:lvl>
   </w:abstractNum>
@@ -5488,6 +3817,12 @@
     <w:lvlOverride w:ilvl="8">
       <w:startOverride w:val="1"/>
     </w:lvlOverride>
+  </w:num>
+  <w:num w:numId="2" w16cid:durableId="1458984039">
+    <w:abstractNumId w:val="2"/>
+  </w:num>
+  <w:num w:numId="3" w16cid:durableId="21441093">
+    <w:abstractNumId w:val="1"/>
   </w:num>
 </w:numbering>
 </file>

</xml_diff>